<commit_message>
Falta anadir fotos y conclusiones
</commit_message>
<xml_diff>
--- a/Practica 1/Submission 1.docx
+++ b/Practica 1/Submission 1.docx
@@ -5,8 +5,13 @@
     <w:sdt>
       <w:sdtPr>
         <w:rPr>
+          <w:rFonts w:eastAsiaTheme="minorHAnsi"/>
           <w:color w:val="156082" w:themeColor="accent1"/>
-          <w:lang w:val="en-GB"/>
+          <w:kern w:val="2"/>
+          <w:sz w:val="24"/>
+          <w:szCs w:val="24"/>
+          <w:lang w:val="en-GB" w:eastAsia="en-US"/>
+          <w14:ligatures w14:val="standardContextual"/>
         </w:rPr>
         <w:id w:val="-1856634679"/>
         <w:docPartObj>
@@ -16,19 +21,13 @@
       </w:sdtPr>
       <w:sdtEndPr>
         <w:rPr>
-          <w:rFonts w:eastAsiaTheme="minorHAnsi"/>
           <w:color w:val="auto"/>
-          <w:kern w:val="2"/>
-          <w:sz w:val="24"/>
-          <w:szCs w:val="24"/>
-          <w:lang w:eastAsia="en-US"/>
-          <w14:ligatures w14:val="standardContextual"/>
         </w:rPr>
       </w:sdtEndPr>
       <w:sdtContent>
         <w:p>
           <w:pPr>
-            <w:pStyle w:val="Sinespaciado"/>
+            <w:pStyle w:val="NoSpacing"/>
             <w:spacing w:before="1540" w:after="240"/>
             <w:jc w:val="center"/>
             <w:rPr>
@@ -38,6 +37,7 @@
           </w:pPr>
           <w:r>
             <w:rPr>
+              <w:noProof/>
               <w:color w:val="156082" w:themeColor="accent1"/>
               <w:lang w:val="en-GB"/>
             </w:rPr>
@@ -116,7 +116,7 @@
           <w:sdtContent>
             <w:p>
               <w:pPr>
-                <w:pStyle w:val="Sinespaciado"/>
+                <w:pStyle w:val="NoSpacing"/>
                 <w:pBdr>
                   <w:top w:val="single" w:sz="6" w:space="6" w:color="156082" w:themeColor="accent1"/>
                   <w:bottom w:val="single" w:sz="6" w:space="6" w:color="156082" w:themeColor="accent1"/>
@@ -165,7 +165,7 @@
           <w:sdtContent>
             <w:p>
               <w:pPr>
-                <w:pStyle w:val="Sinespaciado"/>
+                <w:pStyle w:val="NoSpacing"/>
                 <w:jc w:val="center"/>
                 <w:rPr>
                   <w:color w:val="156082" w:themeColor="accent1"/>
@@ -188,7 +188,7 @@
         </w:sdt>
         <w:p>
           <w:pPr>
-            <w:pStyle w:val="Sinespaciado"/>
+            <w:pStyle w:val="NoSpacing"/>
             <w:spacing w:before="480"/>
             <w:jc w:val="center"/>
             <w:rPr>
@@ -198,6 +198,7 @@
           </w:pPr>
           <w:r>
             <w:rPr>
+              <w:noProof/>
               <w:color w:val="156082" w:themeColor="accent1"/>
               <w:lang w:val="en-GB"/>
             </w:rPr>
@@ -262,7 +263,7 @@
                             <w:txbxContent>
                               <w:p>
                                 <w:pPr>
-                                  <w:pStyle w:val="Sinespaciado"/>
+                                  <w:pStyle w:val="NoSpacing"/>
                                   <w:jc w:val="center"/>
                                   <w:rPr>
                                     <w:color w:val="156082" w:themeColor="accent1"/>
@@ -296,7 +297,7 @@
                               </w:p>
                               <w:p>
                                 <w:pPr>
-                                  <w:pStyle w:val="Sinespaciado"/>
+                                  <w:pStyle w:val="NoSpacing"/>
                                   <w:jc w:val="center"/>
                                   <w:rPr>
                                     <w:color w:val="156082" w:themeColor="accent1"/>
@@ -358,7 +359,7 @@
                       <w:txbxContent>
                         <w:p>
                           <w:pPr>
-                            <w:pStyle w:val="Sinespaciado"/>
+                            <w:pStyle w:val="NoSpacing"/>
                             <w:jc w:val="center"/>
                             <w:rPr>
                               <w:color w:val="156082" w:themeColor="accent1"/>
@@ -392,7 +393,7 @@
                         </w:p>
                         <w:p>
                           <w:pPr>
-                            <w:pStyle w:val="Sinespaciado"/>
+                            <w:pStyle w:val="NoSpacing"/>
                             <w:jc w:val="center"/>
                             <w:rPr>
                               <w:color w:val="156082" w:themeColor="accent1"/>
@@ -433,6 +434,7 @@
           </w:r>
           <w:r>
             <w:rPr>
+              <w:noProof/>
               <w:color w:val="156082" w:themeColor="accent1"/>
               <w:lang w:val="en-GB"/>
             </w:rPr>
@@ -488,7 +490,7 @@
         </w:p>
         <w:p>
           <w:pPr>
-            <w:pStyle w:val="Sinespaciado"/>
+            <w:pStyle w:val="NoSpacing"/>
             <w:spacing w:before="480"/>
             <w:jc w:val="center"/>
             <w:rPr>
@@ -499,7 +501,7 @@
         </w:p>
         <w:p>
           <w:pPr>
-            <w:pStyle w:val="Sinespaciado"/>
+            <w:pStyle w:val="NoSpacing"/>
             <w:spacing w:before="480"/>
             <w:jc w:val="center"/>
             <w:rPr>
@@ -513,6 +515,9 @@
             <w:jc w:val="center"/>
           </w:pPr>
           <w:r>
+            <w:rPr>
+              <w:noProof/>
+            </w:rPr>
             <w:drawing>
               <wp:inline distT="0" distB="0" distL="0" distR="0" wp14:anchorId="1E79F071" wp14:editId="4D0E0962">
                 <wp:extent cx="5033573" cy="2834640"/>
@@ -586,7 +591,7 @@
         </w:p>
         <w:p>
           <w:pPr>
-            <w:pStyle w:val="TDC1"/>
+            <w:pStyle w:val="TOC1"/>
             <w:tabs>
               <w:tab w:val="right" w:leader="dot" w:pos="8494"/>
             </w:tabs>
@@ -608,7 +613,7 @@
           <w:hyperlink w:anchor="_Toc241949097" w:history="1">
             <w:r>
               <w:rPr>
-                <w:rStyle w:val="Hipervnculo"/>
+                <w:rStyle w:val="Hyperlink"/>
                 <w:noProof/>
               </w:rPr>
               <w:t>Section 1 – Mitsubishi Test Kit Analysis</w:t>
@@ -665,7 +670,7 @@
         </w:p>
         <w:p>
           <w:pPr>
-            <w:pStyle w:val="TDC2"/>
+            <w:pStyle w:val="TOC2"/>
             <w:tabs>
               <w:tab w:val="left" w:pos="720"/>
               <w:tab w:val="right" w:leader="dot" w:pos="8494"/>
@@ -679,7 +684,7 @@
           <w:hyperlink w:anchor="_Toc241949098" w:history="1">
             <w:r>
               <w:rPr>
-                <w:rStyle w:val="Hipervnculo"/>
+                <w:rStyle w:val="Hyperlink"/>
                 <w:noProof/>
               </w:rPr>
               <w:t>1.</w:t>
@@ -694,7 +699,7 @@
             </w:r>
             <w:r>
               <w:rPr>
-                <w:rStyle w:val="Hipervnculo"/>
+                <w:rStyle w:val="Hyperlink"/>
                 <w:noProof/>
               </w:rPr>
               <w:t>Mitsubishi FX3G PLC Sketch</w:t>
@@ -751,7 +756,7 @@
         </w:p>
         <w:p>
           <w:pPr>
-            <w:pStyle w:val="TDC2"/>
+            <w:pStyle w:val="TOC2"/>
             <w:tabs>
               <w:tab w:val="left" w:pos="720"/>
               <w:tab w:val="right" w:leader="dot" w:pos="8494"/>
@@ -765,7 +770,7 @@
           <w:hyperlink w:anchor="_Toc241949099" w:history="1">
             <w:r>
               <w:rPr>
-                <w:rStyle w:val="Hipervnculo"/>
+                <w:rStyle w:val="Hyperlink"/>
                 <w:noProof/>
               </w:rPr>
               <w:t>2.</w:t>
@@ -780,7 +785,7 @@
             </w:r>
             <w:r>
               <w:rPr>
-                <w:rStyle w:val="Hipervnculo"/>
+                <w:rStyle w:val="Hyperlink"/>
                 <w:noProof/>
               </w:rPr>
               <w:t>Define the difference between contacts</w:t>
@@ -837,7 +842,7 @@
         </w:p>
         <w:p>
           <w:pPr>
-            <w:pStyle w:val="TDC2"/>
+            <w:pStyle w:val="TOC2"/>
             <w:tabs>
               <w:tab w:val="left" w:pos="720"/>
               <w:tab w:val="right" w:leader="dot" w:pos="8494"/>
@@ -851,7 +856,7 @@
           <w:hyperlink w:anchor="_Toc241949100" w:history="1">
             <w:r>
               <w:rPr>
-                <w:rStyle w:val="Hipervnculo"/>
+                <w:rStyle w:val="Hyperlink"/>
                 <w:noProof/>
               </w:rPr>
               <w:t>3.</w:t>
@@ -866,7 +871,7 @@
             </w:r>
             <w:r>
               <w:rPr>
-                <w:rStyle w:val="Hipervnculo"/>
+                <w:rStyle w:val="Hyperlink"/>
                 <w:noProof/>
               </w:rPr>
               <w:t>Troubleshooting potential electrical fault</w:t>
@@ -923,7 +928,7 @@
         </w:p>
         <w:p>
           <w:pPr>
-            <w:pStyle w:val="TDC1"/>
+            <w:pStyle w:val="TOC1"/>
             <w:tabs>
               <w:tab w:val="right" w:leader="dot" w:pos="8494"/>
             </w:tabs>
@@ -936,7 +941,7 @@
           <w:hyperlink w:anchor="_Toc241949101" w:history="1">
             <w:r>
               <w:rPr>
-                <w:rStyle w:val="Hipervnculo"/>
+                <w:rStyle w:val="Hyperlink"/>
                 <w:noProof/>
               </w:rPr>
               <w:t>Section 2 – Truth Table Analysis</w:t>
@@ -993,7 +998,7 @@
         </w:p>
         <w:p>
           <w:pPr>
-            <w:pStyle w:val="TDC2"/>
+            <w:pStyle w:val="TOC2"/>
             <w:tabs>
               <w:tab w:val="left" w:pos="720"/>
               <w:tab w:val="right" w:leader="dot" w:pos="8494"/>
@@ -1007,7 +1012,7 @@
           <w:hyperlink w:anchor="_Toc241949102" w:history="1">
             <w:r>
               <w:rPr>
-                <w:rStyle w:val="Hipervnculo"/>
+                <w:rStyle w:val="Hyperlink"/>
                 <w:noProof/>
               </w:rPr>
               <w:t>1.</w:t>
@@ -1022,7 +1027,7 @@
             </w:r>
             <w:r>
               <w:rPr>
-                <w:rStyle w:val="Hipervnculo"/>
+                <w:rStyle w:val="Hyperlink"/>
                 <w:noProof/>
               </w:rPr>
               <w:t>Construct a ladder diagram for each of the circuits shown below. Create a new diagram for each circuit.</w:t>
@@ -1079,7 +1084,7 @@
         </w:p>
         <w:p>
           <w:pPr>
-            <w:pStyle w:val="TDC2"/>
+            <w:pStyle w:val="TOC2"/>
             <w:tabs>
               <w:tab w:val="left" w:pos="720"/>
               <w:tab w:val="right" w:leader="dot" w:pos="8494"/>
@@ -1093,7 +1098,7 @@
           <w:hyperlink w:anchor="_Toc241949103" w:history="1">
             <w:r>
               <w:rPr>
-                <w:rStyle w:val="Hipervnculo"/>
+                <w:rStyle w:val="Hyperlink"/>
                 <w:noProof/>
               </w:rPr>
               <w:t>2.</w:t>
@@ -1108,7 +1113,7 @@
             </w:r>
             <w:r>
               <w:rPr>
-                <w:rStyle w:val="Hipervnculo"/>
+                <w:rStyle w:val="Hyperlink"/>
                 <w:noProof/>
               </w:rPr>
               <w:t>Test the ladder logic to ensure there are no errors or warnings.</w:t>
@@ -1165,7 +1170,7 @@
         </w:p>
         <w:p>
           <w:pPr>
-            <w:pStyle w:val="TDC3"/>
+            <w:pStyle w:val="TOC3"/>
             <w:tabs>
               <w:tab w:val="right" w:leader="dot" w:pos="8494"/>
             </w:tabs>
@@ -1178,7 +1183,7 @@
           <w:hyperlink w:anchor="_Toc241949104" w:history="1">
             <w:r>
               <w:rPr>
-                <w:rStyle w:val="Hipervnculo"/>
+                <w:rStyle w:val="Hyperlink"/>
                 <w:noProof/>
               </w:rPr>
               <w:t>Circuit a:</w:t>
@@ -1235,7 +1240,7 @@
         </w:p>
         <w:p>
           <w:pPr>
-            <w:pStyle w:val="TDC3"/>
+            <w:pStyle w:val="TOC3"/>
             <w:tabs>
               <w:tab w:val="right" w:leader="dot" w:pos="8494"/>
             </w:tabs>
@@ -1248,7 +1253,7 @@
           <w:hyperlink w:anchor="_Toc241949105" w:history="1">
             <w:r>
               <w:rPr>
-                <w:rStyle w:val="Hipervnculo"/>
+                <w:rStyle w:val="Hyperlink"/>
                 <w:noProof/>
               </w:rPr>
               <w:t>Circuit b:</w:t>
@@ -1305,7 +1310,7 @@
         </w:p>
         <w:p>
           <w:pPr>
-            <w:pStyle w:val="TDC3"/>
+            <w:pStyle w:val="TOC3"/>
             <w:tabs>
               <w:tab w:val="right" w:leader="dot" w:pos="8494"/>
             </w:tabs>
@@ -1318,7 +1323,7 @@
           <w:hyperlink w:anchor="_Toc241949106" w:history="1">
             <w:r>
               <w:rPr>
-                <w:rStyle w:val="Hipervnculo"/>
+                <w:rStyle w:val="Hyperlink"/>
                 <w:noProof/>
               </w:rPr>
               <w:t>Circuit c:</w:t>
@@ -1375,7 +1380,7 @@
         </w:p>
         <w:p>
           <w:pPr>
-            <w:pStyle w:val="TDC3"/>
+            <w:pStyle w:val="TOC3"/>
             <w:tabs>
               <w:tab w:val="right" w:leader="dot" w:pos="8494"/>
             </w:tabs>
@@ -1388,7 +1393,7 @@
           <w:hyperlink w:anchor="_Toc241949107" w:history="1">
             <w:r>
               <w:rPr>
-                <w:rStyle w:val="Hipervnculo"/>
+                <w:rStyle w:val="Hyperlink"/>
                 <w:noProof/>
               </w:rPr>
               <w:t>Circuit d:</w:t>
@@ -1445,7 +1450,7 @@
         </w:p>
         <w:p>
           <w:pPr>
-            <w:pStyle w:val="TDC3"/>
+            <w:pStyle w:val="TOC3"/>
             <w:tabs>
               <w:tab w:val="right" w:leader="dot" w:pos="8494"/>
             </w:tabs>
@@ -1458,7 +1463,7 @@
           <w:hyperlink w:anchor="_Toc241949108" w:history="1">
             <w:r>
               <w:rPr>
-                <w:rStyle w:val="Hipervnculo"/>
+                <w:rStyle w:val="Hyperlink"/>
                 <w:noProof/>
               </w:rPr>
               <w:t>Circuit e:</w:t>
@@ -1515,7 +1520,7 @@
         </w:p>
         <w:p>
           <w:pPr>
-            <w:pStyle w:val="TDC3"/>
+            <w:pStyle w:val="TOC3"/>
             <w:tabs>
               <w:tab w:val="right" w:leader="dot" w:pos="8494"/>
             </w:tabs>
@@ -1528,7 +1533,7 @@
           <w:hyperlink w:anchor="_Toc241949109" w:history="1">
             <w:r>
               <w:rPr>
-                <w:rStyle w:val="Hipervnculo"/>
+                <w:rStyle w:val="Hyperlink"/>
                 <w:noProof/>
               </w:rPr>
               <w:t>Circuit f:</w:t>
@@ -1585,7 +1590,7 @@
         </w:p>
         <w:p>
           <w:pPr>
-            <w:pStyle w:val="TDC2"/>
+            <w:pStyle w:val="TOC2"/>
             <w:tabs>
               <w:tab w:val="left" w:pos="720"/>
               <w:tab w:val="right" w:leader="dot" w:pos="8494"/>
@@ -1599,7 +1604,7 @@
           <w:hyperlink w:anchor="_Toc241949110" w:history="1">
             <w:r>
               <w:rPr>
-                <w:rStyle w:val="Hipervnculo"/>
+                <w:rStyle w:val="Hyperlink"/>
                 <w:noProof/>
               </w:rPr>
               <w:t>3.</w:t>
@@ -1614,7 +1619,7 @@
             </w:r>
             <w:r>
               <w:rPr>
-                <w:rStyle w:val="Hipervnculo"/>
+                <w:rStyle w:val="Hyperlink"/>
                 <w:noProof/>
               </w:rPr>
               <w:t>Using truth tables, establish the logic function for each circuit. Use Excel to generate a table for all variables.</w:t>
@@ -1671,7 +1676,7 @@
         </w:p>
         <w:p>
           <w:pPr>
-            <w:pStyle w:val="TDC1"/>
+            <w:pStyle w:val="TOC1"/>
             <w:tabs>
               <w:tab w:val="right" w:leader="dot" w:pos="8494"/>
             </w:tabs>
@@ -1684,7 +1689,7 @@
           <w:hyperlink w:anchor="_Toc241949111" w:history="1">
             <w:r>
               <w:rPr>
-                <w:rStyle w:val="Hipervnculo"/>
+                <w:rStyle w:val="Hyperlink"/>
                 <w:noProof/>
               </w:rPr>
               <w:t>Section 3</w:t>
@@ -1741,7 +1746,7 @@
         </w:p>
         <w:p>
           <w:pPr>
-            <w:pStyle w:val="TDC2"/>
+            <w:pStyle w:val="TOC2"/>
             <w:tabs>
               <w:tab w:val="left" w:pos="720"/>
               <w:tab w:val="right" w:leader="dot" w:pos="8494"/>
@@ -1755,7 +1760,7 @@
           <w:hyperlink w:anchor="_Toc241949112" w:history="1">
             <w:r>
               <w:rPr>
-                <w:rStyle w:val="Hipervnculo"/>
+                <w:rStyle w:val="Hyperlink"/>
                 <w:noProof/>
               </w:rPr>
               <w:t>1.</w:t>
@@ -1770,7 +1775,7 @@
             </w:r>
             <w:r>
               <w:rPr>
-                <w:rStyle w:val="Hipervnculo"/>
+                <w:rStyle w:val="Hyperlink"/>
                 <w:noProof/>
               </w:rPr>
               <w:t>Diagram</w:t>
@@ -1827,7 +1832,7 @@
         </w:p>
         <w:p>
           <w:pPr>
-            <w:pStyle w:val="TDC2"/>
+            <w:pStyle w:val="TOC2"/>
             <w:tabs>
               <w:tab w:val="left" w:pos="720"/>
               <w:tab w:val="right" w:leader="dot" w:pos="8494"/>
@@ -1841,7 +1846,7 @@
           <w:hyperlink w:anchor="_Toc241949113" w:history="1">
             <w:r>
               <w:rPr>
-                <w:rStyle w:val="Hipervnculo"/>
+                <w:rStyle w:val="Hyperlink"/>
                 <w:noProof/>
               </w:rPr>
               <w:t>2.</w:t>
@@ -1856,7 +1861,7 @@
             </w:r>
             <w:r>
               <w:rPr>
-                <w:rStyle w:val="Hipervnculo"/>
+                <w:rStyle w:val="Hyperlink"/>
                 <w:noProof/>
               </w:rPr>
               <w:t>PLC test unit</w:t>
@@ -1913,7 +1918,7 @@
         </w:p>
         <w:p>
           <w:pPr>
-            <w:pStyle w:val="TDC2"/>
+            <w:pStyle w:val="TOC2"/>
             <w:tabs>
               <w:tab w:val="left" w:pos="720"/>
               <w:tab w:val="right" w:leader="dot" w:pos="8494"/>
@@ -1927,7 +1932,7 @@
           <w:hyperlink w:anchor="_Toc241949114" w:history="1">
             <w:r>
               <w:rPr>
-                <w:rStyle w:val="Hipervnculo"/>
+                <w:rStyle w:val="Hyperlink"/>
                 <w:noProof/>
               </w:rPr>
               <w:t>3.</w:t>
@@ -1942,7 +1947,7 @@
             </w:r>
             <w:r>
               <w:rPr>
-                <w:rStyle w:val="Hipervnculo"/>
+                <w:rStyle w:val="Hyperlink"/>
                 <w:noProof/>
               </w:rPr>
               <w:t>Wire the 3VDC motor using a control relay so that the motor operates with the ladder logic design. Hint: Two different voltages can be used to achieve the required result.</w:t>
@@ -1999,7 +2004,7 @@
         </w:p>
         <w:p>
           <w:pPr>
-            <w:pStyle w:val="TDC2"/>
+            <w:pStyle w:val="TOC2"/>
             <w:tabs>
               <w:tab w:val="left" w:pos="720"/>
               <w:tab w:val="right" w:leader="dot" w:pos="8494"/>
@@ -2013,7 +2018,7 @@
           <w:hyperlink w:anchor="_Toc241949115" w:history="1">
             <w:r>
               <w:rPr>
-                <w:rStyle w:val="Hipervnculo"/>
+                <w:rStyle w:val="Hyperlink"/>
                 <w:noProof/>
               </w:rPr>
               <w:t>4.</w:t>
@@ -2028,7 +2033,7 @@
             </w:r>
             <w:r>
               <w:rPr>
-                <w:rStyle w:val="Hipervnculo"/>
+                <w:rStyle w:val="Hyperlink"/>
                 <w:noProof/>
               </w:rPr>
               <w:t>Three-phase (415V) supply Diagram</w:t>
@@ -2085,7 +2090,7 @@
         </w:p>
         <w:p>
           <w:pPr>
-            <w:pStyle w:val="TDC2"/>
+            <w:pStyle w:val="TOC2"/>
             <w:tabs>
               <w:tab w:val="left" w:pos="720"/>
               <w:tab w:val="right" w:leader="dot" w:pos="8494"/>
@@ -2099,7 +2104,7 @@
           <w:hyperlink w:anchor="_Toc241949116" w:history="1">
             <w:r>
               <w:rPr>
-                <w:rStyle w:val="Hipervnculo"/>
+                <w:rStyle w:val="Hyperlink"/>
                 <w:noProof/>
               </w:rPr>
               <w:t>5.</w:t>
@@ -2114,7 +2119,7 @@
             </w:r>
             <w:r>
               <w:rPr>
-                <w:rStyle w:val="Hipervnculo"/>
+                <w:rStyle w:val="Hyperlink"/>
                 <w:noProof/>
               </w:rPr>
               <w:t>Conclusion and Discussion of results</w:t>
@@ -2187,23 +2192,20 @@
     </w:p>
     <w:p>
       <w:pPr>
-        <w:pStyle w:val="Ttulo1"/>
+        <w:pStyle w:val="Heading1"/>
         <w:ind w:left="0" w:firstLine="0"/>
       </w:pPr>
       <w:bookmarkStart w:id="0" w:name="_Toc241949097"/>
       <w:r>
         <w:lastRenderedPageBreak/>
-        <w:t xml:space="preserve">Section 1 </w:t>
-      </w:r>
-      <w:r>
-        <w:t>– Mitsubishi Test Kit Analysis</w:t>
+        <w:t>Section 1 – Mitsubishi Test Kit Analysis</w:t>
       </w:r>
       <w:bookmarkEnd w:id="0"/>
     </w:p>
     <w:p/>
     <w:p>
       <w:pPr>
-        <w:pStyle w:val="Ttulo2"/>
+        <w:pStyle w:val="Heading2"/>
         <w:numPr>
           <w:ilvl w:val="0"/>
           <w:numId w:val="4"/>
@@ -2211,10 +2213,7 @@
       </w:pPr>
       <w:bookmarkStart w:id="1" w:name="_Toc241949098"/>
       <w:r>
-        <w:t>Mitsubishi FX3G PLC</w:t>
-      </w:r>
-      <w:r>
-        <w:t xml:space="preserve"> Sketch</w:t>
+        <w:t>Mitsubishi FX3G PLC Sketch</w:t>
       </w:r>
       <w:bookmarkEnd w:id="1"/>
     </w:p>
@@ -2241,6 +2240,9 @@
         <w:jc w:val="center"/>
       </w:pPr>
       <w:r>
+        <w:rPr>
+          <w:noProof/>
+        </w:rPr>
         <w:drawing>
           <wp:inline distT="0" distB="0" distL="0" distR="0" wp14:anchorId="70784E0A" wp14:editId="27FB243D">
             <wp:extent cx="5896362" cy="2768600"/>
@@ -2286,7 +2288,7 @@
     </w:p>
     <w:p>
       <w:pPr>
-        <w:pStyle w:val="Ttulo2"/>
+        <w:pStyle w:val="Heading2"/>
         <w:numPr>
           <w:ilvl w:val="0"/>
           <w:numId w:val="4"/>
@@ -2335,19 +2337,7 @@
         <w:rPr>
           <w:rFonts w:asciiTheme="minorHAnsi" w:hAnsiTheme="minorHAnsi"/>
         </w:rPr>
-        <w:t>A practical</w:t>
-      </w:r>
-      <w:r>
-        <w:rPr>
-          <w:rFonts w:asciiTheme="minorHAnsi" w:hAnsiTheme="minorHAnsi"/>
-        </w:rPr>
-        <w:t xml:space="preserve"> </w:t>
-      </w:r>
-      <w:r>
-        <w:rPr>
-          <w:rFonts w:asciiTheme="minorHAnsi" w:hAnsiTheme="minorHAnsi"/>
-        </w:rPr>
-        <w:t>example is a Start button on a machine's control panel.</w:t>
+        <w:t>A practical example is a Start button on a machine's control panel.</w:t>
       </w:r>
     </w:p>
     <w:p>
@@ -2366,7 +2356,7 @@
     </w:p>
     <w:p>
       <w:pPr>
-        <w:pStyle w:val="Ttulo2"/>
+        <w:pStyle w:val="Heading2"/>
         <w:numPr>
           <w:ilvl w:val="0"/>
           <w:numId w:val="4"/>
@@ -2374,10 +2364,7 @@
       </w:pPr>
       <w:bookmarkStart w:id="3" w:name="_Toc241949100"/>
       <w:r>
-        <w:t>T</w:t>
-      </w:r>
-      <w:r>
-        <w:t>roubleshooting potential electrical fault</w:t>
+        <w:t>Troubleshooting potential electrical fault</w:t>
       </w:r>
       <w:bookmarkEnd w:id="3"/>
     </w:p>
@@ -2408,22 +2395,7 @@
       </w:r>
       <w:proofErr w:type="spellEnd"/>
       <w:r>
-        <w:t xml:space="preserve">, the very first thing you need to check is the </w:t>
-      </w:r>
-      <w:r>
-        <w:t>p</w:t>
-      </w:r>
-      <w:r>
-        <w:t xml:space="preserve">ower </w:t>
-      </w:r>
-      <w:r>
-        <w:t>s</w:t>
-      </w:r>
-      <w:r>
-        <w:t>upply</w:t>
-      </w:r>
-      <w:r>
-        <w:t xml:space="preserve">. </w:t>
+        <w:t xml:space="preserve">, the very first thing you need to check is the power supply. </w:t>
       </w:r>
       <w:r>
         <w:t xml:space="preserve">You need to check that it is </w:t>
@@ -2435,30 +2407,24 @@
     </w:p>
     <w:p>
       <w:r>
-        <w:t>If it fails or is turned off, the entire PLC loses power. Doing this step first is key to ruling out a basic power drop before moving on to trickier diagnostics with the wiring or the ladder logic</w:t>
-      </w:r>
-      <w:r>
-        <w:t>.</w:t>
+        <w:t>If it fails or is turned off, the entire PLC loses power. Doing this step first is key to ruling out a basic power drop before moving on to trickier diagnostics with the wiring or the ladder logic.</w:t>
       </w:r>
     </w:p>
     <w:p/>
     <w:p>
       <w:pPr>
-        <w:pStyle w:val="Ttulo1"/>
+        <w:pStyle w:val="Heading1"/>
       </w:pPr>
       <w:bookmarkStart w:id="4" w:name="_Toc241949101"/>
       <w:r>
-        <w:t xml:space="preserve">Section 2 </w:t>
-      </w:r>
-      <w:r>
-        <w:t>– Truth Table Analysis</w:t>
+        <w:t>Section 2 – Truth Table Analysis</w:t>
       </w:r>
       <w:bookmarkEnd w:id="4"/>
     </w:p>
     <w:p/>
     <w:p>
       <w:pPr>
-        <w:pStyle w:val="Ttulo2"/>
+        <w:pStyle w:val="Heading2"/>
         <w:numPr>
           <w:ilvl w:val="0"/>
           <w:numId w:val="6"/>
@@ -2472,7 +2438,7 @@
     </w:p>
     <w:p>
       <w:pPr>
-        <w:pStyle w:val="Ttulo2"/>
+        <w:pStyle w:val="Heading2"/>
         <w:numPr>
           <w:ilvl w:val="0"/>
           <w:numId w:val="6"/>
@@ -2487,7 +2453,7 @@
     <w:p/>
     <w:p>
       <w:pPr>
-        <w:pStyle w:val="Listaconnmeros"/>
+        <w:pStyle w:val="ListNumber"/>
         <w:numPr>
           <w:ilvl w:val="0"/>
           <w:numId w:val="0"/>
@@ -2500,7 +2466,7 @@
     </w:p>
     <w:p>
       <w:pPr>
-        <w:pStyle w:val="Ttulo3"/>
+        <w:pStyle w:val="Heading3"/>
       </w:pPr>
       <w:bookmarkStart w:id="7" w:name="_Toc241949104"/>
       <w:r>
@@ -2514,6 +2480,9 @@
         <w:jc w:val="center"/>
       </w:pPr>
       <w:r>
+        <w:rPr>
+          <w:noProof/>
+        </w:rPr>
         <w:drawing>
           <wp:inline distT="0" distB="0" distL="0" distR="0" wp14:anchorId="7079BEC9" wp14:editId="27671DDB">
             <wp:extent cx="4114800" cy="2125141"/>
@@ -2553,7 +2522,7 @@
     </w:p>
     <w:p>
       <w:pPr>
-        <w:pStyle w:val="Descripcin"/>
+        <w:pStyle w:val="Caption"/>
         <w:jc w:val="center"/>
       </w:pPr>
       <w:r>
@@ -2590,6 +2559,7 @@
       </w:pPr>
       <w:r>
         <w:rPr>
+          <w:noProof/>
           <w:lang w:val="en-US"/>
         </w:rPr>
         <w:drawing>
@@ -2631,7 +2601,7 @@
     </w:p>
     <w:p>
       <w:pPr>
-        <w:pStyle w:val="Descripcin"/>
+        <w:pStyle w:val="Caption"/>
         <w:jc w:val="center"/>
       </w:pPr>
       <w:r>
@@ -2662,7 +2632,7 @@
     <w:p/>
     <w:p>
       <w:pPr>
-        <w:pStyle w:val="Ttulo3"/>
+        <w:pStyle w:val="Heading3"/>
       </w:pPr>
       <w:bookmarkStart w:id="8" w:name="_Toc241949105"/>
       <w:r>
@@ -2676,6 +2646,9 @@
         <w:jc w:val="center"/>
       </w:pPr>
       <w:r>
+        <w:rPr>
+          <w:noProof/>
+        </w:rPr>
         <w:drawing>
           <wp:inline distT="0" distB="0" distL="0" distR="0" wp14:anchorId="52335607" wp14:editId="27F03EF1">
             <wp:extent cx="4235450" cy="2121211"/>
@@ -2715,7 +2688,7 @@
     </w:p>
     <w:p>
       <w:pPr>
-        <w:pStyle w:val="Descripcin"/>
+        <w:pStyle w:val="Caption"/>
         <w:jc w:val="center"/>
       </w:pPr>
       <w:r>
@@ -2750,6 +2723,7 @@
       </w:pPr>
       <w:r>
         <w:rPr>
+          <w:noProof/>
           <w:lang w:val="en-US"/>
         </w:rPr>
         <w:drawing>
@@ -2791,7 +2765,7 @@
     </w:p>
     <w:p>
       <w:pPr>
-        <w:pStyle w:val="Descripcin"/>
+        <w:pStyle w:val="Caption"/>
         <w:jc w:val="center"/>
       </w:pPr>
       <w:r>
@@ -2823,7 +2797,7 @@
     <w:p/>
     <w:p>
       <w:pPr>
-        <w:pStyle w:val="Ttulo3"/>
+        <w:pStyle w:val="Heading3"/>
       </w:pPr>
       <w:bookmarkStart w:id="9" w:name="_Toc241949106"/>
       <w:r>
@@ -2838,6 +2812,9 @@
         <w:jc w:val="center"/>
       </w:pPr>
       <w:r>
+        <w:rPr>
+          <w:noProof/>
+        </w:rPr>
         <w:drawing>
           <wp:inline distT="0" distB="0" distL="0" distR="0" wp14:anchorId="1CD1DEBD" wp14:editId="75373755">
             <wp:extent cx="4272497" cy="2137254"/>
@@ -2877,7 +2854,7 @@
     </w:p>
     <w:p>
       <w:pPr>
-        <w:pStyle w:val="Descripcin"/>
+        <w:pStyle w:val="Caption"/>
         <w:jc w:val="center"/>
       </w:pPr>
       <w:r>
@@ -2912,6 +2889,7 @@
       </w:pPr>
       <w:r>
         <w:rPr>
+          <w:noProof/>
           <w:lang w:val="en-US"/>
         </w:rPr>
         <w:drawing>
@@ -2953,7 +2931,7 @@
     </w:p>
     <w:p>
       <w:pPr>
-        <w:pStyle w:val="Descripcin"/>
+        <w:pStyle w:val="Caption"/>
         <w:jc w:val="center"/>
         <w:rPr>
           <w:lang w:val="en-US"/>
@@ -2988,7 +2966,7 @@
     <w:p/>
     <w:p>
       <w:pPr>
-        <w:pStyle w:val="Ttulo3"/>
+        <w:pStyle w:val="Heading3"/>
       </w:pPr>
       <w:bookmarkStart w:id="10" w:name="_Toc241949107"/>
       <w:r>
@@ -3002,6 +2980,9 @@
         <w:jc w:val="center"/>
       </w:pPr>
       <w:r>
+        <w:rPr>
+          <w:noProof/>
+        </w:rPr>
         <w:drawing>
           <wp:inline distT="0" distB="0" distL="0" distR="0" wp14:anchorId="4030F958" wp14:editId="0AC27DAE">
             <wp:extent cx="4196659" cy="2108200"/>
@@ -3041,7 +3022,7 @@
     </w:p>
     <w:p>
       <w:pPr>
-        <w:pStyle w:val="Descripcin"/>
+        <w:pStyle w:val="Caption"/>
         <w:jc w:val="center"/>
       </w:pPr>
       <w:r>
@@ -3075,6 +3056,9 @@
         <w:jc w:val="center"/>
       </w:pPr>
       <w:r>
+        <w:rPr>
+          <w:noProof/>
+        </w:rPr>
         <w:lastRenderedPageBreak/>
         <w:drawing>
           <wp:inline distT="0" distB="0" distL="0" distR="0" wp14:anchorId="4C96E1BF" wp14:editId="629890CC">
@@ -3115,7 +3099,7 @@
     </w:p>
     <w:p>
       <w:pPr>
-        <w:pStyle w:val="Descripcin"/>
+        <w:pStyle w:val="Caption"/>
         <w:jc w:val="center"/>
       </w:pPr>
       <w:r>
@@ -3146,7 +3130,7 @@
     <w:p/>
     <w:p>
       <w:pPr>
-        <w:pStyle w:val="Ttulo3"/>
+        <w:pStyle w:val="Heading3"/>
       </w:pPr>
       <w:bookmarkStart w:id="11" w:name="_Toc241949108"/>
       <w:r>
@@ -3160,6 +3144,9 @@
         <w:jc w:val="center"/>
       </w:pPr>
       <w:r>
+        <w:rPr>
+          <w:noProof/>
+        </w:rPr>
         <w:drawing>
           <wp:inline distT="0" distB="0" distL="0" distR="0" wp14:anchorId="25DCBC48" wp14:editId="434A4FB1">
             <wp:extent cx="4184650" cy="2100198"/>
@@ -3199,7 +3186,7 @@
     </w:p>
     <w:p>
       <w:pPr>
-        <w:pStyle w:val="Descripcin"/>
+        <w:pStyle w:val="Caption"/>
         <w:jc w:val="center"/>
       </w:pPr>
       <w:r>
@@ -3233,6 +3220,9 @@
         <w:jc w:val="center"/>
       </w:pPr>
       <w:r>
+        <w:rPr>
+          <w:noProof/>
+        </w:rPr>
         <w:drawing>
           <wp:inline distT="0" distB="0" distL="0" distR="0" wp14:anchorId="62F3082C" wp14:editId="31337B9F">
             <wp:extent cx="4165600" cy="2214077"/>
@@ -3272,7 +3262,7 @@
     </w:p>
     <w:p>
       <w:pPr>
-        <w:pStyle w:val="Descripcin"/>
+        <w:pStyle w:val="Caption"/>
         <w:jc w:val="center"/>
       </w:pPr>
       <w:r>
@@ -3302,7 +3292,7 @@
     </w:p>
     <w:p>
       <w:pPr>
-        <w:pStyle w:val="Ttulo3"/>
+        <w:pStyle w:val="Heading3"/>
       </w:pPr>
       <w:bookmarkStart w:id="12" w:name="_Toc241949109"/>
       <w:r>
@@ -3317,6 +3307,9 @@
         <w:jc w:val="center"/>
       </w:pPr>
       <w:r>
+        <w:rPr>
+          <w:noProof/>
+        </w:rPr>
         <w:drawing>
           <wp:inline distT="0" distB="0" distL="0" distR="0" wp14:anchorId="182810F3" wp14:editId="291EF179">
             <wp:extent cx="4171950" cy="2095787"/>
@@ -3356,7 +3349,7 @@
     </w:p>
     <w:p>
       <w:pPr>
-        <w:pStyle w:val="Descripcin"/>
+        <w:pStyle w:val="Caption"/>
         <w:jc w:val="center"/>
       </w:pPr>
       <w:r>
@@ -3390,6 +3383,9 @@
         <w:jc w:val="center"/>
       </w:pPr>
       <w:r>
+        <w:rPr>
+          <w:noProof/>
+        </w:rPr>
         <w:drawing>
           <wp:inline distT="0" distB="0" distL="0" distR="0" wp14:anchorId="339C6B70" wp14:editId="5E316E92">
             <wp:extent cx="4165600" cy="2212118"/>
@@ -3429,7 +3425,7 @@
     </w:p>
     <w:p>
       <w:pPr>
-        <w:pStyle w:val="Descripcin"/>
+        <w:pStyle w:val="Caption"/>
         <w:jc w:val="center"/>
       </w:pPr>
       <w:r>
@@ -3459,7 +3455,7 @@
     </w:p>
     <w:p>
       <w:pPr>
-        <w:pStyle w:val="Ttulo2"/>
+        <w:pStyle w:val="Heading2"/>
         <w:numPr>
           <w:ilvl w:val="0"/>
           <w:numId w:val="6"/>
@@ -3486,7 +3482,7 @@
     <w:p/>
     <w:p>
       <w:pPr>
-        <w:pStyle w:val="Ttulo1"/>
+        <w:pStyle w:val="Heading1"/>
       </w:pPr>
       <w:bookmarkStart w:id="14" w:name="_Toc241949111"/>
       <w:r>
@@ -3497,7 +3493,7 @@
     </w:p>
     <w:p>
       <w:pPr>
-        <w:pStyle w:val="Ttulo2"/>
+        <w:pStyle w:val="Heading2"/>
         <w:numPr>
           <w:ilvl w:val="0"/>
           <w:numId w:val="7"/>
@@ -3515,6 +3511,9 @@
         <w:jc w:val="center"/>
       </w:pPr>
       <w:r>
+        <w:rPr>
+          <w:noProof/>
+        </w:rPr>
         <w:drawing>
           <wp:inline distT="0" distB="0" distL="0" distR="0" wp14:anchorId="725784FA" wp14:editId="580FD8A5">
             <wp:extent cx="4759036" cy="2380637"/>
@@ -3554,7 +3553,7 @@
     </w:p>
     <w:p>
       <w:pPr>
-        <w:pStyle w:val="Descripcin"/>
+        <w:pStyle w:val="Caption"/>
         <w:jc w:val="center"/>
       </w:pPr>
       <w:r>
@@ -3588,6 +3587,9 @@
         <w:jc w:val="center"/>
       </w:pPr>
       <w:r>
+        <w:rPr>
+          <w:noProof/>
+        </w:rPr>
         <w:drawing>
           <wp:inline distT="0" distB="0" distL="0" distR="0" wp14:anchorId="09A4A4F4" wp14:editId="4D3A3508">
             <wp:extent cx="4765964" cy="2528136"/>
@@ -3627,7 +3629,7 @@
     </w:p>
     <w:p>
       <w:pPr>
-        <w:pStyle w:val="Descripcin"/>
+        <w:pStyle w:val="Caption"/>
         <w:jc w:val="center"/>
       </w:pPr>
       <w:r>
@@ -3657,7 +3659,7 @@
     </w:p>
     <w:p>
       <w:pPr>
-        <w:pStyle w:val="Ttulo2"/>
+        <w:pStyle w:val="Heading2"/>
         <w:numPr>
           <w:ilvl w:val="0"/>
           <w:numId w:val="7"/>
@@ -3672,42 +3674,21 @@
     <w:p/>
     <w:p>
       <w:pPr>
-        <w:pStyle w:val="Ttulo2"/>
+        <w:pStyle w:val="Heading2"/>
         <w:numPr>
           <w:ilvl w:val="0"/>
           <w:numId w:val="7"/>
         </w:numPr>
       </w:pPr>
-      <w:bookmarkStart w:id="17" w:name="_Toc241949114"/>
-      <w:r>
-        <w:t>Wire the 3VDC motor using a control relay so that the motor operates with the ladder logic design. Hint: Two different voltages can be used to achieve the required result.</w:t>
+      <w:bookmarkStart w:id="17" w:name="_Toc241949115"/>
+      <w:r>
+        <w:lastRenderedPageBreak/>
+        <w:t>Three-phase (415V) supply</w:t>
+      </w:r>
+      <w:r>
+        <w:t xml:space="preserve"> Diagram</w:t>
       </w:r>
       <w:bookmarkEnd w:id="17"/>
-      <w:r>
-        <w:t xml:space="preserve"> </w:t>
-      </w:r>
-    </w:p>
-    <w:p/>
-    <w:p>
-      <w:pPr>
-        <w:pStyle w:val="Ttulo2"/>
-        <w:numPr>
-          <w:ilvl w:val="0"/>
-          <w:numId w:val="7"/>
-        </w:numPr>
-      </w:pPr>
-      <w:bookmarkStart w:id="18" w:name="_Toc241949115"/>
-      <w:r>
-        <w:lastRenderedPageBreak/>
-        <w:t>T</w:t>
-      </w:r>
-      <w:r>
-        <w:t>hree-phase (415V) supply</w:t>
-      </w:r>
-      <w:r>
-        <w:t xml:space="preserve"> Diagram</w:t>
-      </w:r>
-      <w:bookmarkEnd w:id="18"/>
     </w:p>
     <w:p>
       <w:pPr>
@@ -3763,7 +3744,7 @@
     </w:p>
     <w:p>
       <w:pPr>
-        <w:pStyle w:val="Descripcin"/>
+        <w:pStyle w:val="Caption"/>
         <w:jc w:val="center"/>
       </w:pPr>
       <w:r>
@@ -3799,17 +3780,17 @@
     </w:p>
     <w:p>
       <w:pPr>
-        <w:pStyle w:val="Ttulo2"/>
+        <w:pStyle w:val="Heading2"/>
         <w:numPr>
           <w:ilvl w:val="0"/>
           <w:numId w:val="7"/>
         </w:numPr>
       </w:pPr>
-      <w:bookmarkStart w:id="19" w:name="_Toc241949116"/>
+      <w:bookmarkStart w:id="18" w:name="_Toc241949116"/>
       <w:r>
         <w:t>Conclusion and Discussion of results</w:t>
       </w:r>
-      <w:bookmarkEnd w:id="19"/>
+      <w:bookmarkEnd w:id="18"/>
       <w:r>
         <w:tab/>
       </w:r>
@@ -3835,7 +3816,7 @@
     <w:lvl w:ilvl="0">
       <w:start w:val="1"/>
       <w:numFmt w:val="decimal"/>
-      <w:pStyle w:val="Listaconnmeros"/>
+      <w:pStyle w:val="ListNumber"/>
       <w:lvlText w:val="%1."/>
       <w:lvlJc w:val="left"/>
       <w:pPr>
@@ -4808,11 +4789,11 @@
       <w:lang w:val="en-GB"/>
     </w:rPr>
   </w:style>
-  <w:style w:type="paragraph" w:styleId="Ttulo1">
+  <w:style w:type="paragraph" w:styleId="Heading1">
     <w:name w:val="heading 1"/>
     <w:basedOn w:val="Normal"/>
     <w:next w:val="Normal"/>
-    <w:link w:val="Ttulo1Car"/>
+    <w:link w:val="Heading1Char"/>
     <w:autoRedefine/>
     <w:uiPriority w:val="9"/>
     <w:qFormat/>
@@ -4835,11 +4816,11 @@
       <w:szCs w:val="29"/>
     </w:rPr>
   </w:style>
-  <w:style w:type="paragraph" w:styleId="Ttulo2">
+  <w:style w:type="paragraph" w:styleId="Heading2">
     <w:name w:val="heading 2"/>
     <w:basedOn w:val="Normal"/>
     <w:next w:val="Normal"/>
-    <w:link w:val="Ttulo2Car"/>
+    <w:link w:val="Heading2Char"/>
     <w:autoRedefine/>
     <w:uiPriority w:val="9"/>
     <w:unhideWhenUsed/>
@@ -4861,11 +4842,11 @@
       <w:szCs w:val="23"/>
     </w:rPr>
   </w:style>
-  <w:style w:type="paragraph" w:styleId="Ttulo3">
+  <w:style w:type="paragraph" w:styleId="Heading3">
     <w:name w:val="heading 3"/>
     <w:basedOn w:val="Normal"/>
     <w:next w:val="Normal"/>
-    <w:link w:val="Ttulo3Car"/>
+    <w:link w:val="Heading3Char"/>
     <w:uiPriority w:val="9"/>
     <w:unhideWhenUsed/>
     <w:qFormat/>
@@ -4883,11 +4864,11 @@
       <w:szCs w:val="28"/>
     </w:rPr>
   </w:style>
-  <w:style w:type="paragraph" w:styleId="Ttulo4">
+  <w:style w:type="paragraph" w:styleId="Heading4">
     <w:name w:val="heading 4"/>
     <w:basedOn w:val="Normal"/>
     <w:next w:val="Normal"/>
-    <w:link w:val="Ttulo4Car"/>
+    <w:link w:val="Heading4Char"/>
     <w:uiPriority w:val="9"/>
     <w:semiHidden/>
     <w:unhideWhenUsed/>
@@ -4906,11 +4887,11 @@
       <w:color w:val="0F4761" w:themeColor="accent1" w:themeShade="BF"/>
     </w:rPr>
   </w:style>
-  <w:style w:type="paragraph" w:styleId="Ttulo5">
+  <w:style w:type="paragraph" w:styleId="Heading5">
     <w:name w:val="heading 5"/>
     <w:basedOn w:val="Normal"/>
     <w:next w:val="Normal"/>
-    <w:link w:val="Ttulo5Car"/>
+    <w:link w:val="Heading5Char"/>
     <w:uiPriority w:val="9"/>
     <w:semiHidden/>
     <w:unhideWhenUsed/>
@@ -4927,11 +4908,11 @@
       <w:color w:val="0F4761" w:themeColor="accent1" w:themeShade="BF"/>
     </w:rPr>
   </w:style>
-  <w:style w:type="paragraph" w:styleId="Ttulo6">
+  <w:style w:type="paragraph" w:styleId="Heading6">
     <w:name w:val="heading 6"/>
     <w:basedOn w:val="Normal"/>
     <w:next w:val="Normal"/>
-    <w:link w:val="Ttulo6Car"/>
+    <w:link w:val="Heading6Char"/>
     <w:uiPriority w:val="9"/>
     <w:semiHidden/>
     <w:unhideWhenUsed/>
@@ -4950,11 +4931,11 @@
       <w:color w:val="595959" w:themeColor="text1" w:themeTint="A6"/>
     </w:rPr>
   </w:style>
-  <w:style w:type="paragraph" w:styleId="Ttulo7">
+  <w:style w:type="paragraph" w:styleId="Heading7">
     <w:name w:val="heading 7"/>
     <w:basedOn w:val="Normal"/>
     <w:next w:val="Normal"/>
-    <w:link w:val="Ttulo7Car"/>
+    <w:link w:val="Heading7Char"/>
     <w:uiPriority w:val="9"/>
     <w:semiHidden/>
     <w:unhideWhenUsed/>
@@ -4971,11 +4952,11 @@
       <w:color w:val="595959" w:themeColor="text1" w:themeTint="A6"/>
     </w:rPr>
   </w:style>
-  <w:style w:type="paragraph" w:styleId="Ttulo8">
+  <w:style w:type="paragraph" w:styleId="Heading8">
     <w:name w:val="heading 8"/>
     <w:basedOn w:val="Normal"/>
     <w:next w:val="Normal"/>
-    <w:link w:val="Ttulo8Car"/>
+    <w:link w:val="Heading8Char"/>
     <w:uiPriority w:val="9"/>
     <w:semiHidden/>
     <w:unhideWhenUsed/>
@@ -4994,11 +4975,11 @@
       <w:color w:val="272727" w:themeColor="text1" w:themeTint="D8"/>
     </w:rPr>
   </w:style>
-  <w:style w:type="paragraph" w:styleId="Ttulo9">
+  <w:style w:type="paragraph" w:styleId="Heading9">
     <w:name w:val="heading 9"/>
     <w:basedOn w:val="Normal"/>
     <w:next w:val="Normal"/>
-    <w:link w:val="Ttulo9Car"/>
+    <w:link w:val="Heading9Char"/>
     <w:uiPriority w:val="9"/>
     <w:semiHidden/>
     <w:unhideWhenUsed/>
@@ -5015,12 +4996,13 @@
       <w:color w:val="272727" w:themeColor="text1" w:themeTint="D8"/>
     </w:rPr>
   </w:style>
-  <w:style w:type="character" w:default="1" w:styleId="Fuentedeprrafopredeter">
+  <w:style w:type="character" w:default="1" w:styleId="DefaultParagraphFont">
     <w:name w:val="Default Paragraph Font"/>
     <w:uiPriority w:val="1"/>
+    <w:semiHidden/>
     <w:unhideWhenUsed/>
   </w:style>
-  <w:style w:type="table" w:default="1" w:styleId="Tablanormal">
+  <w:style w:type="table" w:default="1" w:styleId="TableNormal">
     <w:name w:val="Normal Table"/>
     <w:uiPriority w:val="99"/>
     <w:semiHidden/>
@@ -5035,16 +5017,16 @@
       </w:tblCellMar>
     </w:tblPr>
   </w:style>
-  <w:style w:type="numbering" w:default="1" w:styleId="Sinlista">
+  <w:style w:type="numbering" w:default="1" w:styleId="NoList">
     <w:name w:val="No List"/>
     <w:uiPriority w:val="99"/>
     <w:semiHidden/>
     <w:unhideWhenUsed/>
   </w:style>
-  <w:style w:type="character" w:customStyle="1" w:styleId="Ttulo1Car">
-    <w:name w:val="Título 1 Car"/>
-    <w:basedOn w:val="Fuentedeprrafopredeter"/>
-    <w:link w:val="Ttulo1"/>
+  <w:style w:type="character" w:customStyle="1" w:styleId="Heading1Char">
+    <w:name w:val="Heading 1 Char"/>
+    <w:basedOn w:val="DefaultParagraphFont"/>
+    <w:link w:val="Heading1"/>
     <w:uiPriority w:val="9"/>
     <w:rsid w:val="00CF289F"/>
     <w:rPr>
@@ -5055,10 +5037,10 @@
       <w:szCs w:val="29"/>
     </w:rPr>
   </w:style>
-  <w:style w:type="character" w:customStyle="1" w:styleId="Ttulo2Car">
-    <w:name w:val="Título 2 Car"/>
-    <w:basedOn w:val="Fuentedeprrafopredeter"/>
-    <w:link w:val="Ttulo2"/>
+  <w:style w:type="character" w:customStyle="1" w:styleId="Heading2Char">
+    <w:name w:val="Heading 2 Char"/>
+    <w:basedOn w:val="DefaultParagraphFont"/>
+    <w:link w:val="Heading2"/>
     <w:uiPriority w:val="9"/>
     <w:rsid w:val="0094206E"/>
     <w:rPr>
@@ -5068,10 +5050,10 @@
       <w:szCs w:val="23"/>
     </w:rPr>
   </w:style>
-  <w:style w:type="character" w:customStyle="1" w:styleId="Ttulo3Car">
-    <w:name w:val="Título 3 Car"/>
-    <w:basedOn w:val="Fuentedeprrafopredeter"/>
-    <w:link w:val="Ttulo3"/>
+  <w:style w:type="character" w:customStyle="1" w:styleId="Heading3Char">
+    <w:name w:val="Heading 3 Char"/>
+    <w:basedOn w:val="DefaultParagraphFont"/>
+    <w:link w:val="Heading3"/>
     <w:uiPriority w:val="9"/>
     <w:rsid w:val="000C0CF6"/>
     <w:rPr>
@@ -5081,10 +5063,10 @@
       <w:szCs w:val="28"/>
     </w:rPr>
   </w:style>
-  <w:style w:type="character" w:customStyle="1" w:styleId="Ttulo4Car">
-    <w:name w:val="Título 4 Car"/>
-    <w:basedOn w:val="Fuentedeprrafopredeter"/>
-    <w:link w:val="Ttulo4"/>
+  <w:style w:type="character" w:customStyle="1" w:styleId="Heading4Char">
+    <w:name w:val="Heading 4 Char"/>
+    <w:basedOn w:val="DefaultParagraphFont"/>
+    <w:link w:val="Heading4"/>
     <w:uiPriority w:val="9"/>
     <w:semiHidden/>
     <w:rsid w:val="000C0CF6"/>
@@ -5095,10 +5077,10 @@
       <w:color w:val="0F4761" w:themeColor="accent1" w:themeShade="BF"/>
     </w:rPr>
   </w:style>
-  <w:style w:type="character" w:customStyle="1" w:styleId="Ttulo5Car">
-    <w:name w:val="Título 5 Car"/>
-    <w:basedOn w:val="Fuentedeprrafopredeter"/>
-    <w:link w:val="Ttulo5"/>
+  <w:style w:type="character" w:customStyle="1" w:styleId="Heading5Char">
+    <w:name w:val="Heading 5 Char"/>
+    <w:basedOn w:val="DefaultParagraphFont"/>
+    <w:link w:val="Heading5"/>
     <w:uiPriority w:val="9"/>
     <w:semiHidden/>
     <w:rsid w:val="000C0CF6"/>
@@ -5107,10 +5089,10 @@
       <w:color w:val="0F4761" w:themeColor="accent1" w:themeShade="BF"/>
     </w:rPr>
   </w:style>
-  <w:style w:type="character" w:customStyle="1" w:styleId="Ttulo6Car">
-    <w:name w:val="Título 6 Car"/>
-    <w:basedOn w:val="Fuentedeprrafopredeter"/>
-    <w:link w:val="Ttulo6"/>
+  <w:style w:type="character" w:customStyle="1" w:styleId="Heading6Char">
+    <w:name w:val="Heading 6 Char"/>
+    <w:basedOn w:val="DefaultParagraphFont"/>
+    <w:link w:val="Heading6"/>
     <w:uiPriority w:val="9"/>
     <w:semiHidden/>
     <w:rsid w:val="000C0CF6"/>
@@ -5121,10 +5103,10 @@
       <w:color w:val="595959" w:themeColor="text1" w:themeTint="A6"/>
     </w:rPr>
   </w:style>
-  <w:style w:type="character" w:customStyle="1" w:styleId="Ttulo7Car">
-    <w:name w:val="Título 7 Car"/>
-    <w:basedOn w:val="Fuentedeprrafopredeter"/>
-    <w:link w:val="Ttulo7"/>
+  <w:style w:type="character" w:customStyle="1" w:styleId="Heading7Char">
+    <w:name w:val="Heading 7 Char"/>
+    <w:basedOn w:val="DefaultParagraphFont"/>
+    <w:link w:val="Heading7"/>
     <w:uiPriority w:val="9"/>
     <w:semiHidden/>
     <w:rsid w:val="000C0CF6"/>
@@ -5133,10 +5115,10 @@
       <w:color w:val="595959" w:themeColor="text1" w:themeTint="A6"/>
     </w:rPr>
   </w:style>
-  <w:style w:type="character" w:customStyle="1" w:styleId="Ttulo8Car">
-    <w:name w:val="Título 8 Car"/>
-    <w:basedOn w:val="Fuentedeprrafopredeter"/>
-    <w:link w:val="Ttulo8"/>
+  <w:style w:type="character" w:customStyle="1" w:styleId="Heading8Char">
+    <w:name w:val="Heading 8 Char"/>
+    <w:basedOn w:val="DefaultParagraphFont"/>
+    <w:link w:val="Heading8"/>
     <w:uiPriority w:val="9"/>
     <w:semiHidden/>
     <w:rsid w:val="000C0CF6"/>
@@ -5147,10 +5129,10 @@
       <w:color w:val="272727" w:themeColor="text1" w:themeTint="D8"/>
     </w:rPr>
   </w:style>
-  <w:style w:type="character" w:customStyle="1" w:styleId="Ttulo9Car">
-    <w:name w:val="Título 9 Car"/>
-    <w:basedOn w:val="Fuentedeprrafopredeter"/>
-    <w:link w:val="Ttulo9"/>
+  <w:style w:type="character" w:customStyle="1" w:styleId="Heading9Char">
+    <w:name w:val="Heading 9 Char"/>
+    <w:basedOn w:val="DefaultParagraphFont"/>
+    <w:link w:val="Heading9"/>
     <w:uiPriority w:val="9"/>
     <w:semiHidden/>
     <w:rsid w:val="000C0CF6"/>
@@ -5159,11 +5141,11 @@
       <w:color w:val="272727" w:themeColor="text1" w:themeTint="D8"/>
     </w:rPr>
   </w:style>
-  <w:style w:type="paragraph" w:styleId="Ttulo">
+  <w:style w:type="paragraph" w:styleId="Title">
     <w:name w:val="Title"/>
     <w:basedOn w:val="Normal"/>
     <w:next w:val="Normal"/>
-    <w:link w:val="TtuloCar"/>
+    <w:link w:val="TitleChar"/>
     <w:uiPriority w:val="10"/>
     <w:qFormat/>
     <w:rsid w:val="000C0CF6"/>
@@ -5179,10 +5161,10 @@
       <w:szCs w:val="56"/>
     </w:rPr>
   </w:style>
-  <w:style w:type="character" w:customStyle="1" w:styleId="TtuloCar">
-    <w:name w:val="Título Car"/>
-    <w:basedOn w:val="Fuentedeprrafopredeter"/>
-    <w:link w:val="Ttulo"/>
+  <w:style w:type="character" w:customStyle="1" w:styleId="TitleChar">
+    <w:name w:val="Title Char"/>
+    <w:basedOn w:val="DefaultParagraphFont"/>
+    <w:link w:val="Title"/>
     <w:uiPriority w:val="10"/>
     <w:rsid w:val="000C0CF6"/>
     <w:rPr>
@@ -5193,11 +5175,11 @@
       <w:szCs w:val="56"/>
     </w:rPr>
   </w:style>
-  <w:style w:type="paragraph" w:styleId="Subttulo">
+  <w:style w:type="paragraph" w:styleId="Subtitle">
     <w:name w:val="Subtitle"/>
     <w:basedOn w:val="Normal"/>
     <w:next w:val="Normal"/>
-    <w:link w:val="SubttuloCar"/>
+    <w:link w:val="SubtitleChar"/>
     <w:uiPriority w:val="11"/>
     <w:qFormat/>
     <w:rsid w:val="000C0CF6"/>
@@ -5214,10 +5196,10 @@
       <w:szCs w:val="28"/>
     </w:rPr>
   </w:style>
-  <w:style w:type="character" w:customStyle="1" w:styleId="SubttuloCar">
-    <w:name w:val="Subtítulo Car"/>
-    <w:basedOn w:val="Fuentedeprrafopredeter"/>
-    <w:link w:val="Subttulo"/>
+  <w:style w:type="character" w:customStyle="1" w:styleId="SubtitleChar">
+    <w:name w:val="Subtitle Char"/>
+    <w:basedOn w:val="DefaultParagraphFont"/>
+    <w:link w:val="Subtitle"/>
     <w:uiPriority w:val="11"/>
     <w:rsid w:val="000C0CF6"/>
     <w:rPr>
@@ -5228,11 +5210,11 @@
       <w:szCs w:val="28"/>
     </w:rPr>
   </w:style>
-  <w:style w:type="paragraph" w:styleId="Cita">
+  <w:style w:type="paragraph" w:styleId="Quote">
     <w:name w:val="Quote"/>
     <w:basedOn w:val="Normal"/>
     <w:next w:val="Normal"/>
-    <w:link w:val="CitaCar"/>
+    <w:link w:val="QuoteChar"/>
     <w:uiPriority w:val="29"/>
     <w:qFormat/>
     <w:rsid w:val="000C0CF6"/>
@@ -5246,10 +5228,10 @@
       <w:color w:val="404040" w:themeColor="text1" w:themeTint="BF"/>
     </w:rPr>
   </w:style>
-  <w:style w:type="character" w:customStyle="1" w:styleId="CitaCar">
-    <w:name w:val="Cita Car"/>
-    <w:basedOn w:val="Fuentedeprrafopredeter"/>
-    <w:link w:val="Cita"/>
+  <w:style w:type="character" w:customStyle="1" w:styleId="QuoteChar">
+    <w:name w:val="Quote Char"/>
+    <w:basedOn w:val="DefaultParagraphFont"/>
+    <w:link w:val="Quote"/>
     <w:uiPriority w:val="29"/>
     <w:rsid w:val="000C0CF6"/>
     <w:rPr>
@@ -5258,7 +5240,7 @@
       <w:color w:val="404040" w:themeColor="text1" w:themeTint="BF"/>
     </w:rPr>
   </w:style>
-  <w:style w:type="paragraph" w:styleId="Prrafodelista">
+  <w:style w:type="paragraph" w:styleId="ListParagraph">
     <w:name w:val="List Paragraph"/>
     <w:basedOn w:val="Normal"/>
     <w:uiPriority w:val="34"/>
@@ -5269,9 +5251,9 @@
       <w:contextualSpacing/>
     </w:pPr>
   </w:style>
-  <w:style w:type="character" w:styleId="nfasisintenso">
+  <w:style w:type="character" w:styleId="IntenseEmphasis">
     <w:name w:val="Intense Emphasis"/>
-    <w:basedOn w:val="Fuentedeprrafopredeter"/>
+    <w:basedOn w:val="DefaultParagraphFont"/>
     <w:uiPriority w:val="21"/>
     <w:qFormat/>
     <w:rsid w:val="000C0CF6"/>
@@ -5281,11 +5263,11 @@
       <w:color w:val="0F4761" w:themeColor="accent1" w:themeShade="BF"/>
     </w:rPr>
   </w:style>
-  <w:style w:type="paragraph" w:styleId="Citadestacada">
+  <w:style w:type="paragraph" w:styleId="IntenseQuote">
     <w:name w:val="Intense Quote"/>
     <w:basedOn w:val="Normal"/>
     <w:next w:val="Normal"/>
-    <w:link w:val="CitadestacadaCar"/>
+    <w:link w:val="IntenseQuoteChar"/>
     <w:uiPriority w:val="30"/>
     <w:qFormat/>
     <w:rsid w:val="000C0CF6"/>
@@ -5304,10 +5286,10 @@
       <w:color w:val="0F4761" w:themeColor="accent1" w:themeShade="BF"/>
     </w:rPr>
   </w:style>
-  <w:style w:type="character" w:customStyle="1" w:styleId="CitadestacadaCar">
-    <w:name w:val="Cita destacada Car"/>
-    <w:basedOn w:val="Fuentedeprrafopredeter"/>
-    <w:link w:val="Citadestacada"/>
+  <w:style w:type="character" w:customStyle="1" w:styleId="IntenseQuoteChar">
+    <w:name w:val="Intense Quote Char"/>
+    <w:basedOn w:val="DefaultParagraphFont"/>
+    <w:link w:val="IntenseQuote"/>
     <w:uiPriority w:val="30"/>
     <w:rsid w:val="000C0CF6"/>
     <w:rPr>
@@ -5316,9 +5298,9 @@
       <w:color w:val="0F4761" w:themeColor="accent1" w:themeShade="BF"/>
     </w:rPr>
   </w:style>
-  <w:style w:type="character" w:styleId="Referenciaintensa">
+  <w:style w:type="character" w:styleId="IntenseReference">
     <w:name w:val="Intense Reference"/>
-    <w:basedOn w:val="Fuentedeprrafopredeter"/>
+    <w:basedOn w:val="DefaultParagraphFont"/>
     <w:uiPriority w:val="32"/>
     <w:qFormat/>
     <w:rsid w:val="000C0CF6"/>
@@ -5330,9 +5312,9 @@
       <w:spacing w:val="5"/>
     </w:rPr>
   </w:style>
-  <w:style w:type="paragraph" w:styleId="Sinespaciado">
+  <w:style w:type="paragraph" w:styleId="NoSpacing">
     <w:name w:val="No Spacing"/>
-    <w:link w:val="SinespaciadoCar"/>
+    <w:link w:val="NoSpacingChar"/>
     <w:uiPriority w:val="1"/>
     <w:qFormat/>
     <w:rsid w:val="000C0CF6"/>
@@ -5348,10 +5330,10 @@
       <w14:ligatures w14:val="none"/>
     </w:rPr>
   </w:style>
-  <w:style w:type="character" w:customStyle="1" w:styleId="SinespaciadoCar">
-    <w:name w:val="Sin espaciado Car"/>
-    <w:basedOn w:val="Fuentedeprrafopredeter"/>
-    <w:link w:val="Sinespaciado"/>
+  <w:style w:type="character" w:customStyle="1" w:styleId="NoSpacingChar">
+    <w:name w:val="No Spacing Char"/>
+    <w:basedOn w:val="DefaultParagraphFont"/>
+    <w:link w:val="NoSpacing"/>
     <w:uiPriority w:val="1"/>
     <w:rsid w:val="000C0CF6"/>
     <w:rPr>
@@ -5363,9 +5345,9 @@
       <w14:ligatures w14:val="none"/>
     </w:rPr>
   </w:style>
-  <w:style w:type="paragraph" w:styleId="TtuloTDC">
+  <w:style w:type="paragraph" w:styleId="TOCHeading">
     <w:name w:val="TOC Heading"/>
-    <w:basedOn w:val="Ttulo1"/>
+    <w:basedOn w:val="Heading1"/>
     <w:next w:val="Normal"/>
     <w:uiPriority w:val="39"/>
     <w:unhideWhenUsed/>
@@ -5388,7 +5370,7 @@
       <w14:ligatures w14:val="none"/>
     </w:rPr>
   </w:style>
-  <w:style w:type="paragraph" w:styleId="TDC1">
+  <w:style w:type="paragraph" w:styleId="TOC1">
     <w:name w:val="toc 1"/>
     <w:basedOn w:val="Normal"/>
     <w:next w:val="Normal"/>
@@ -5400,9 +5382,9 @@
       <w:spacing w:after="100"/>
     </w:pPr>
   </w:style>
-  <w:style w:type="character" w:styleId="Hipervnculo">
+  <w:style w:type="character" w:styleId="Hyperlink">
     <w:name w:val="Hyperlink"/>
-    <w:basedOn w:val="Fuentedeprrafopredeter"/>
+    <w:basedOn w:val="DefaultParagraphFont"/>
     <w:uiPriority w:val="99"/>
     <w:unhideWhenUsed/>
     <w:rsid w:val="00A656FE"/>
@@ -5427,7 +5409,7 @@
       <w14:ligatures w14:val="none"/>
     </w:rPr>
   </w:style>
-  <w:style w:type="paragraph" w:styleId="TDC2">
+  <w:style w:type="paragraph" w:styleId="TOC2">
     <w:name w:val="toc 2"/>
     <w:basedOn w:val="Normal"/>
     <w:next w:val="Normal"/>
@@ -5440,7 +5422,7 @@
       <w:ind w:left="240"/>
     </w:pPr>
   </w:style>
-  <w:style w:type="paragraph" w:styleId="Listaconnmeros">
+  <w:style w:type="paragraph" w:styleId="ListNumber">
     <w:name w:val="List Number"/>
     <w:basedOn w:val="Normal"/>
     <w:uiPriority w:val="99"/>
@@ -5466,7 +5448,7 @@
       <w14:ligatures w14:val="none"/>
     </w:rPr>
   </w:style>
-  <w:style w:type="paragraph" w:styleId="Descripcin">
+  <w:style w:type="paragraph" w:styleId="Caption">
     <w:name w:val="caption"/>
     <w:basedOn w:val="Normal"/>
     <w:next w:val="Normal"/>
@@ -5485,7 +5467,7 @@
       <w:szCs w:val="18"/>
     </w:rPr>
   </w:style>
-  <w:style w:type="paragraph" w:styleId="TDC3">
+  <w:style w:type="paragraph" w:styleId="TOC3">
     <w:name w:val="toc 3"/>
     <w:basedOn w:val="Normal"/>
     <w:next w:val="Normal"/>
@@ -5623,6 +5605,9 @@
     <w:rsid w:val="002B5ECD"/>
     <w:rsid w:val="003C6555"/>
     <w:rsid w:val="00435790"/>
+    <w:rsid w:val="007A2EE3"/>
+    <w:rsid w:val="00A43EF4"/>
+    <w:rsid w:val="00E62EF5"/>
   </w:rsids>
   <m:mathPr>
     <m:mathFont m:val="Cambria Math"/>
@@ -5639,8 +5624,8 @@
   </m:mathPr>
   <w:themeFontLang w:val="es-ES"/>
   <w:clrSchemeMapping w:bg1="light1" w:t1="dark1" w:bg2="light2" w:t2="dark2" w:accent1="accent1" w:accent2="accent2" w:accent3="accent3" w:accent4="accent4" w:accent5="accent5" w:accent6="accent6" w:hyperlink="hyperlink" w:followedHyperlink="followedHyperlink"/>
-  <w:decimalSymbol w:val=","/>
-  <w:listSeparator w:val=";"/>
+  <w:decimalSymbol w:val="."/>
+  <w:listSeparator w:val=","/>
   <w15:chartTrackingRefBased/>
 </w:settings>
 </file>
@@ -6046,13 +6031,13 @@
     <w:name w:val="Normal"/>
     <w:qFormat/>
   </w:style>
-  <w:style w:type="character" w:default="1" w:styleId="Fuentedeprrafopredeter">
+  <w:style w:type="character" w:default="1" w:styleId="DefaultParagraphFont">
     <w:name w:val="Default Paragraph Font"/>
     <w:uiPriority w:val="1"/>
     <w:semiHidden/>
     <w:unhideWhenUsed/>
   </w:style>
-  <w:style w:type="table" w:default="1" w:styleId="Tablanormal">
+  <w:style w:type="table" w:default="1" w:styleId="TableNormal">
     <w:name w:val="Normal Table"/>
     <w:uiPriority w:val="99"/>
     <w:semiHidden/>
@@ -6067,7 +6052,7 @@
       </w:tblCellMar>
     </w:tblPr>
   </w:style>
-  <w:style w:type="numbering" w:default="1" w:styleId="Sinlista">
+  <w:style w:type="numbering" w:default="1" w:styleId="NoList">
     <w:name w:val="No List"/>
     <w:uiPriority w:val="99"/>
     <w:semiHidden/>
@@ -6416,4 +6401,10 @@
     <ds:schemaRef ds:uri="http://schemas.openxmlformats.org/officeDocument/2006/bibliography"/>
   </ds:schemaRefs>
 </ds:datastoreItem>
+</file>
+
+<file path=docMetadata/LabelInfo.xml><?xml version="1.0" encoding="utf-8"?>
+<clbl:labelList xmlns:clbl="http://schemas.microsoft.com/office/2020/mipLabelMetadata">
+  <clbl:label id="{47855545-00bb-4800-a65f-e79104ec0fc4}" enabled="0" method="" siteId="{47855545-00bb-4800-a65f-e79104ec0fc4}" removed="1"/>
+</clbl:labelList>
 </file>
</xml_diff>

<commit_message>
Faltan fotos en la PLC y conclusiones
</commit_message>
<xml_diff>
--- a/Practica 1/Submission 1.docx
+++ b/Practica 1/Submission 1.docx
@@ -27,7 +27,7 @@
       <w:sdtContent>
         <w:p>
           <w:pPr>
-            <w:pStyle w:val="NoSpacing"/>
+            <w:pStyle w:val="Sinespaciado"/>
             <w:spacing w:before="1540" w:after="240"/>
             <w:jc w:val="center"/>
             <w:rPr>
@@ -116,7 +116,7 @@
           <w:sdtContent>
             <w:p>
               <w:pPr>
-                <w:pStyle w:val="NoSpacing"/>
+                <w:pStyle w:val="Sinespaciado"/>
                 <w:pBdr>
                   <w:top w:val="single" w:sz="6" w:space="6" w:color="156082" w:themeColor="accent1"/>
                   <w:bottom w:val="single" w:sz="6" w:space="6" w:color="156082" w:themeColor="accent1"/>
@@ -165,7 +165,7 @@
           <w:sdtContent>
             <w:p>
               <w:pPr>
-                <w:pStyle w:val="NoSpacing"/>
+                <w:pStyle w:val="Sinespaciado"/>
                 <w:jc w:val="center"/>
                 <w:rPr>
                   <w:color w:val="156082" w:themeColor="accent1"/>
@@ -188,7 +188,7 @@
         </w:sdt>
         <w:p>
           <w:pPr>
-            <w:pStyle w:val="NoSpacing"/>
+            <w:pStyle w:val="Sinespaciado"/>
             <w:spacing w:before="480"/>
             <w:jc w:val="center"/>
             <w:rPr>
@@ -263,7 +263,7 @@
                             <w:txbxContent>
                               <w:p>
                                 <w:pPr>
-                                  <w:pStyle w:val="NoSpacing"/>
+                                  <w:pStyle w:val="Sinespaciado"/>
                                   <w:jc w:val="center"/>
                                   <w:rPr>
                                     <w:color w:val="156082" w:themeColor="accent1"/>
@@ -297,7 +297,7 @@
                               </w:p>
                               <w:p>
                                 <w:pPr>
-                                  <w:pStyle w:val="NoSpacing"/>
+                                  <w:pStyle w:val="Sinespaciado"/>
                                   <w:jc w:val="center"/>
                                   <w:rPr>
                                     <w:color w:val="156082" w:themeColor="accent1"/>
@@ -359,7 +359,7 @@
                       <w:txbxContent>
                         <w:p>
                           <w:pPr>
-                            <w:pStyle w:val="NoSpacing"/>
+                            <w:pStyle w:val="Sinespaciado"/>
                             <w:jc w:val="center"/>
                             <w:rPr>
                               <w:color w:val="156082" w:themeColor="accent1"/>
@@ -393,7 +393,7 @@
                         </w:p>
                         <w:p>
                           <w:pPr>
-                            <w:pStyle w:val="NoSpacing"/>
+                            <w:pStyle w:val="Sinespaciado"/>
                             <w:jc w:val="center"/>
                             <w:rPr>
                               <w:color w:val="156082" w:themeColor="accent1"/>
@@ -490,7 +490,7 @@
         </w:p>
         <w:p>
           <w:pPr>
-            <w:pStyle w:val="NoSpacing"/>
+            <w:pStyle w:val="Sinespaciado"/>
             <w:spacing w:before="480"/>
             <w:jc w:val="center"/>
             <w:rPr>
@@ -501,7 +501,7 @@
         </w:p>
         <w:p>
           <w:pPr>
-            <w:pStyle w:val="NoSpacing"/>
+            <w:pStyle w:val="Sinespaciado"/>
             <w:spacing w:before="480"/>
             <w:jc w:val="center"/>
             <w:rPr>
@@ -591,7 +591,7 @@
         </w:p>
         <w:p>
           <w:pPr>
-            <w:pStyle w:val="TOC1"/>
+            <w:pStyle w:val="TDC1"/>
             <w:tabs>
               <w:tab w:val="right" w:leader="dot" w:pos="8494"/>
             </w:tabs>
@@ -610,10 +610,10 @@
           <w:r>
             <w:fldChar w:fldCharType="separate"/>
           </w:r>
-          <w:hyperlink w:anchor="_Toc241949097" w:history="1">
-            <w:r>
-              <w:rPr>
-                <w:rStyle w:val="Hyperlink"/>
+          <w:hyperlink w:anchor="_Toc242299893" w:history="1">
+            <w:r>
+              <w:rPr>
+                <w:rStyle w:val="Hipervnculo"/>
                 <w:noProof/>
               </w:rPr>
               <w:t>Section 1 – Mitsubishi Test Kit Analysis</w:t>
@@ -637,7 +637,7 @@
                 <w:noProof/>
                 <w:webHidden/>
               </w:rPr>
-              <w:instrText xml:space="preserve"> PAGEREF _Toc241949097 \h </w:instrText>
+              <w:instrText xml:space="preserve"> PAGEREF _Toc242299893 \h </w:instrText>
             </w:r>
             <w:r>
               <w:rPr>
@@ -670,7 +670,7 @@
         </w:p>
         <w:p>
           <w:pPr>
-            <w:pStyle w:val="TOC2"/>
+            <w:pStyle w:val="TDC2"/>
             <w:tabs>
               <w:tab w:val="left" w:pos="720"/>
               <w:tab w:val="right" w:leader="dot" w:pos="8494"/>
@@ -681,10 +681,10 @@
               <w:lang w:val="es-ES" w:eastAsia="es-ES"/>
             </w:rPr>
           </w:pPr>
-          <w:hyperlink w:anchor="_Toc241949098" w:history="1">
-            <w:r>
-              <w:rPr>
-                <w:rStyle w:val="Hyperlink"/>
+          <w:hyperlink w:anchor="_Toc242299894" w:history="1">
+            <w:r>
+              <w:rPr>
+                <w:rStyle w:val="Hipervnculo"/>
                 <w:noProof/>
               </w:rPr>
               <w:t>1.</w:t>
@@ -699,7 +699,7 @@
             </w:r>
             <w:r>
               <w:rPr>
-                <w:rStyle w:val="Hyperlink"/>
+                <w:rStyle w:val="Hipervnculo"/>
                 <w:noProof/>
               </w:rPr>
               <w:t>Mitsubishi FX3G PLC Sketch</w:t>
@@ -723,7 +723,7 @@
                 <w:noProof/>
                 <w:webHidden/>
               </w:rPr>
-              <w:instrText xml:space="preserve"> PAGEREF _Toc241949098 \h </w:instrText>
+              <w:instrText xml:space="preserve"> PAGEREF _Toc242299894 \h </w:instrText>
             </w:r>
             <w:r>
               <w:rPr>
@@ -756,7 +756,7 @@
         </w:p>
         <w:p>
           <w:pPr>
-            <w:pStyle w:val="TOC2"/>
+            <w:pStyle w:val="TDC2"/>
             <w:tabs>
               <w:tab w:val="left" w:pos="720"/>
               <w:tab w:val="right" w:leader="dot" w:pos="8494"/>
@@ -767,10 +767,10 @@
               <w:lang w:val="es-ES" w:eastAsia="es-ES"/>
             </w:rPr>
           </w:pPr>
-          <w:hyperlink w:anchor="_Toc241949099" w:history="1">
-            <w:r>
-              <w:rPr>
-                <w:rStyle w:val="Hyperlink"/>
+          <w:hyperlink w:anchor="_Toc242299895" w:history="1">
+            <w:r>
+              <w:rPr>
+                <w:rStyle w:val="Hipervnculo"/>
                 <w:noProof/>
               </w:rPr>
               <w:t>2.</w:t>
@@ -785,7 +785,7 @@
             </w:r>
             <w:r>
               <w:rPr>
-                <w:rStyle w:val="Hyperlink"/>
+                <w:rStyle w:val="Hipervnculo"/>
                 <w:noProof/>
               </w:rPr>
               <w:t>Define the difference between contacts</w:t>
@@ -809,7 +809,7 @@
                 <w:noProof/>
                 <w:webHidden/>
               </w:rPr>
-              <w:instrText xml:space="preserve"> PAGEREF _Toc241949099 \h </w:instrText>
+              <w:instrText xml:space="preserve"> PAGEREF _Toc242299895 \h </w:instrText>
             </w:r>
             <w:r>
               <w:rPr>
@@ -842,7 +842,7 @@
         </w:p>
         <w:p>
           <w:pPr>
-            <w:pStyle w:val="TOC2"/>
+            <w:pStyle w:val="TDC2"/>
             <w:tabs>
               <w:tab w:val="left" w:pos="720"/>
               <w:tab w:val="right" w:leader="dot" w:pos="8494"/>
@@ -853,10 +853,10 @@
               <w:lang w:val="es-ES" w:eastAsia="es-ES"/>
             </w:rPr>
           </w:pPr>
-          <w:hyperlink w:anchor="_Toc241949100" w:history="1">
-            <w:r>
-              <w:rPr>
-                <w:rStyle w:val="Hyperlink"/>
+          <w:hyperlink w:anchor="_Toc242299896" w:history="1">
+            <w:r>
+              <w:rPr>
+                <w:rStyle w:val="Hipervnculo"/>
                 <w:noProof/>
               </w:rPr>
               <w:t>3.</w:t>
@@ -871,7 +871,7 @@
             </w:r>
             <w:r>
               <w:rPr>
-                <w:rStyle w:val="Hyperlink"/>
+                <w:rStyle w:val="Hipervnculo"/>
                 <w:noProof/>
               </w:rPr>
               <w:t>Troubleshooting potential electrical fault</w:t>
@@ -895,7 +895,7 @@
                 <w:noProof/>
                 <w:webHidden/>
               </w:rPr>
-              <w:instrText xml:space="preserve"> PAGEREF _Toc241949100 \h </w:instrText>
+              <w:instrText xml:space="preserve"> PAGEREF _Toc242299896 \h </w:instrText>
             </w:r>
             <w:r>
               <w:rPr>
@@ -928,7 +928,7 @@
         </w:p>
         <w:p>
           <w:pPr>
-            <w:pStyle w:val="TOC1"/>
+            <w:pStyle w:val="TDC1"/>
             <w:tabs>
               <w:tab w:val="right" w:leader="dot" w:pos="8494"/>
             </w:tabs>
@@ -938,10 +938,10 @@
               <w:lang w:val="es-ES" w:eastAsia="es-ES"/>
             </w:rPr>
           </w:pPr>
-          <w:hyperlink w:anchor="_Toc241949101" w:history="1">
-            <w:r>
-              <w:rPr>
-                <w:rStyle w:val="Hyperlink"/>
+          <w:hyperlink w:anchor="_Toc242299897" w:history="1">
+            <w:r>
+              <w:rPr>
+                <w:rStyle w:val="Hipervnculo"/>
                 <w:noProof/>
               </w:rPr>
               <w:t>Section 2 – Truth Table Analysis</w:t>
@@ -965,7 +965,7 @@
                 <w:noProof/>
                 <w:webHidden/>
               </w:rPr>
-              <w:instrText xml:space="preserve"> PAGEREF _Toc241949101 \h </w:instrText>
+              <w:instrText xml:space="preserve"> PAGEREF _Toc242299897 \h </w:instrText>
             </w:r>
             <w:r>
               <w:rPr>
@@ -998,7 +998,7 @@
         </w:p>
         <w:p>
           <w:pPr>
-            <w:pStyle w:val="TOC2"/>
+            <w:pStyle w:val="TDC2"/>
             <w:tabs>
               <w:tab w:val="left" w:pos="720"/>
               <w:tab w:val="right" w:leader="dot" w:pos="8494"/>
@@ -1009,10 +1009,10 @@
               <w:lang w:val="es-ES" w:eastAsia="es-ES"/>
             </w:rPr>
           </w:pPr>
-          <w:hyperlink w:anchor="_Toc241949102" w:history="1">
-            <w:r>
-              <w:rPr>
-                <w:rStyle w:val="Hyperlink"/>
+          <w:hyperlink w:anchor="_Toc242299898" w:history="1">
+            <w:r>
+              <w:rPr>
+                <w:rStyle w:val="Hipervnculo"/>
                 <w:noProof/>
               </w:rPr>
               <w:t>1.</w:t>
@@ -1027,7 +1027,7 @@
             </w:r>
             <w:r>
               <w:rPr>
-                <w:rStyle w:val="Hyperlink"/>
+                <w:rStyle w:val="Hipervnculo"/>
                 <w:noProof/>
               </w:rPr>
               <w:t>Construct a ladder diagram for each of the circuits shown below. Create a new diagram for each circuit.</w:t>
@@ -1051,7 +1051,7 @@
                 <w:noProof/>
                 <w:webHidden/>
               </w:rPr>
-              <w:instrText xml:space="preserve"> PAGEREF _Toc241949102 \h </w:instrText>
+              <w:instrText xml:space="preserve"> PAGEREF _Toc242299898 \h </w:instrText>
             </w:r>
             <w:r>
               <w:rPr>
@@ -1084,7 +1084,7 @@
         </w:p>
         <w:p>
           <w:pPr>
-            <w:pStyle w:val="TOC2"/>
+            <w:pStyle w:val="TDC2"/>
             <w:tabs>
               <w:tab w:val="left" w:pos="720"/>
               <w:tab w:val="right" w:leader="dot" w:pos="8494"/>
@@ -1095,10 +1095,10 @@
               <w:lang w:val="es-ES" w:eastAsia="es-ES"/>
             </w:rPr>
           </w:pPr>
-          <w:hyperlink w:anchor="_Toc241949103" w:history="1">
-            <w:r>
-              <w:rPr>
-                <w:rStyle w:val="Hyperlink"/>
+          <w:hyperlink w:anchor="_Toc242299899" w:history="1">
+            <w:r>
+              <w:rPr>
+                <w:rStyle w:val="Hipervnculo"/>
                 <w:noProof/>
               </w:rPr>
               <w:t>2.</w:t>
@@ -1113,7 +1113,7 @@
             </w:r>
             <w:r>
               <w:rPr>
-                <w:rStyle w:val="Hyperlink"/>
+                <w:rStyle w:val="Hipervnculo"/>
                 <w:noProof/>
               </w:rPr>
               <w:t>Test the ladder logic to ensure there are no errors or warnings.</w:t>
@@ -1137,7 +1137,7 @@
                 <w:noProof/>
                 <w:webHidden/>
               </w:rPr>
-              <w:instrText xml:space="preserve"> PAGEREF _Toc241949103 \h </w:instrText>
+              <w:instrText xml:space="preserve"> PAGEREF _Toc242299899 \h </w:instrText>
             </w:r>
             <w:r>
               <w:rPr>
@@ -1170,7 +1170,7 @@
         </w:p>
         <w:p>
           <w:pPr>
-            <w:pStyle w:val="TOC3"/>
+            <w:pStyle w:val="TDC3"/>
             <w:tabs>
               <w:tab w:val="right" w:leader="dot" w:pos="8494"/>
             </w:tabs>
@@ -1180,10 +1180,10 @@
               <w:lang w:val="es-ES" w:eastAsia="es-ES"/>
             </w:rPr>
           </w:pPr>
-          <w:hyperlink w:anchor="_Toc241949104" w:history="1">
-            <w:r>
-              <w:rPr>
-                <w:rStyle w:val="Hyperlink"/>
+          <w:hyperlink w:anchor="_Toc242299900" w:history="1">
+            <w:r>
+              <w:rPr>
+                <w:rStyle w:val="Hipervnculo"/>
                 <w:noProof/>
               </w:rPr>
               <w:t>Circuit a:</w:t>
@@ -1207,7 +1207,7 @@
                 <w:noProof/>
                 <w:webHidden/>
               </w:rPr>
-              <w:instrText xml:space="preserve"> PAGEREF _Toc241949104 \h </w:instrText>
+              <w:instrText xml:space="preserve"> PAGEREF _Toc242299900 \h </w:instrText>
             </w:r>
             <w:r>
               <w:rPr>
@@ -1240,7 +1240,7 @@
         </w:p>
         <w:p>
           <w:pPr>
-            <w:pStyle w:val="TOC3"/>
+            <w:pStyle w:val="TDC3"/>
             <w:tabs>
               <w:tab w:val="right" w:leader="dot" w:pos="8494"/>
             </w:tabs>
@@ -1250,10 +1250,10 @@
               <w:lang w:val="es-ES" w:eastAsia="es-ES"/>
             </w:rPr>
           </w:pPr>
-          <w:hyperlink w:anchor="_Toc241949105" w:history="1">
-            <w:r>
-              <w:rPr>
-                <w:rStyle w:val="Hyperlink"/>
+          <w:hyperlink w:anchor="_Toc242299901" w:history="1">
+            <w:r>
+              <w:rPr>
+                <w:rStyle w:val="Hipervnculo"/>
                 <w:noProof/>
               </w:rPr>
               <w:t>Circuit b:</w:t>
@@ -1277,7 +1277,7 @@
                 <w:noProof/>
                 <w:webHidden/>
               </w:rPr>
-              <w:instrText xml:space="preserve"> PAGEREF _Toc241949105 \h </w:instrText>
+              <w:instrText xml:space="preserve"> PAGEREF _Toc242299901 \h </w:instrText>
             </w:r>
             <w:r>
               <w:rPr>
@@ -1310,7 +1310,7 @@
         </w:p>
         <w:p>
           <w:pPr>
-            <w:pStyle w:val="TOC3"/>
+            <w:pStyle w:val="TDC3"/>
             <w:tabs>
               <w:tab w:val="right" w:leader="dot" w:pos="8494"/>
             </w:tabs>
@@ -1320,10 +1320,10 @@
               <w:lang w:val="es-ES" w:eastAsia="es-ES"/>
             </w:rPr>
           </w:pPr>
-          <w:hyperlink w:anchor="_Toc241949106" w:history="1">
-            <w:r>
-              <w:rPr>
-                <w:rStyle w:val="Hyperlink"/>
+          <w:hyperlink w:anchor="_Toc242299902" w:history="1">
+            <w:r>
+              <w:rPr>
+                <w:rStyle w:val="Hipervnculo"/>
                 <w:noProof/>
               </w:rPr>
               <w:t>Circuit c:</w:t>
@@ -1347,7 +1347,7 @@
                 <w:noProof/>
                 <w:webHidden/>
               </w:rPr>
-              <w:instrText xml:space="preserve"> PAGEREF _Toc241949106 \h </w:instrText>
+              <w:instrText xml:space="preserve"> PAGEREF _Toc242299902 \h </w:instrText>
             </w:r>
             <w:r>
               <w:rPr>
@@ -1380,7 +1380,7 @@
         </w:p>
         <w:p>
           <w:pPr>
-            <w:pStyle w:val="TOC3"/>
+            <w:pStyle w:val="TDC3"/>
             <w:tabs>
               <w:tab w:val="right" w:leader="dot" w:pos="8494"/>
             </w:tabs>
@@ -1390,10 +1390,10 @@
               <w:lang w:val="es-ES" w:eastAsia="es-ES"/>
             </w:rPr>
           </w:pPr>
-          <w:hyperlink w:anchor="_Toc241949107" w:history="1">
-            <w:r>
-              <w:rPr>
-                <w:rStyle w:val="Hyperlink"/>
+          <w:hyperlink w:anchor="_Toc242299903" w:history="1">
+            <w:r>
+              <w:rPr>
+                <w:rStyle w:val="Hipervnculo"/>
                 <w:noProof/>
               </w:rPr>
               <w:t>Circuit d:</w:t>
@@ -1417,7 +1417,7 @@
                 <w:noProof/>
                 <w:webHidden/>
               </w:rPr>
-              <w:instrText xml:space="preserve"> PAGEREF _Toc241949107 \h </w:instrText>
+              <w:instrText xml:space="preserve"> PAGEREF _Toc242299903 \h </w:instrText>
             </w:r>
             <w:r>
               <w:rPr>
@@ -1450,7 +1450,7 @@
         </w:p>
         <w:p>
           <w:pPr>
-            <w:pStyle w:val="TOC3"/>
+            <w:pStyle w:val="TDC3"/>
             <w:tabs>
               <w:tab w:val="right" w:leader="dot" w:pos="8494"/>
             </w:tabs>
@@ -1460,10 +1460,10 @@
               <w:lang w:val="es-ES" w:eastAsia="es-ES"/>
             </w:rPr>
           </w:pPr>
-          <w:hyperlink w:anchor="_Toc241949108" w:history="1">
-            <w:r>
-              <w:rPr>
-                <w:rStyle w:val="Hyperlink"/>
+          <w:hyperlink w:anchor="_Toc242299904" w:history="1">
+            <w:r>
+              <w:rPr>
+                <w:rStyle w:val="Hipervnculo"/>
                 <w:noProof/>
               </w:rPr>
               <w:t>Circuit e:</w:t>
@@ -1487,7 +1487,7 @@
                 <w:noProof/>
                 <w:webHidden/>
               </w:rPr>
-              <w:instrText xml:space="preserve"> PAGEREF _Toc241949108 \h </w:instrText>
+              <w:instrText xml:space="preserve"> PAGEREF _Toc242299904 \h </w:instrText>
             </w:r>
             <w:r>
               <w:rPr>
@@ -1520,7 +1520,7 @@
         </w:p>
         <w:p>
           <w:pPr>
-            <w:pStyle w:val="TOC3"/>
+            <w:pStyle w:val="TDC3"/>
             <w:tabs>
               <w:tab w:val="right" w:leader="dot" w:pos="8494"/>
             </w:tabs>
@@ -1530,10 +1530,10 @@
               <w:lang w:val="es-ES" w:eastAsia="es-ES"/>
             </w:rPr>
           </w:pPr>
-          <w:hyperlink w:anchor="_Toc241949109" w:history="1">
-            <w:r>
-              <w:rPr>
-                <w:rStyle w:val="Hyperlink"/>
+          <w:hyperlink w:anchor="_Toc242299905" w:history="1">
+            <w:r>
+              <w:rPr>
+                <w:rStyle w:val="Hipervnculo"/>
                 <w:noProof/>
               </w:rPr>
               <w:t>Circuit f:</w:t>
@@ -1557,7 +1557,7 @@
                 <w:noProof/>
                 <w:webHidden/>
               </w:rPr>
-              <w:instrText xml:space="preserve"> PAGEREF _Toc241949109 \h </w:instrText>
+              <w:instrText xml:space="preserve"> PAGEREF _Toc242299905 \h </w:instrText>
             </w:r>
             <w:r>
               <w:rPr>
@@ -1590,7 +1590,7 @@
         </w:p>
         <w:p>
           <w:pPr>
-            <w:pStyle w:val="TOC2"/>
+            <w:pStyle w:val="TDC2"/>
             <w:tabs>
               <w:tab w:val="left" w:pos="720"/>
               <w:tab w:val="right" w:leader="dot" w:pos="8494"/>
@@ -1601,10 +1601,10 @@
               <w:lang w:val="es-ES" w:eastAsia="es-ES"/>
             </w:rPr>
           </w:pPr>
-          <w:hyperlink w:anchor="_Toc241949110" w:history="1">
-            <w:r>
-              <w:rPr>
-                <w:rStyle w:val="Hyperlink"/>
+          <w:hyperlink w:anchor="_Toc242299906" w:history="1">
+            <w:r>
+              <w:rPr>
+                <w:rStyle w:val="Hipervnculo"/>
                 <w:noProof/>
               </w:rPr>
               <w:t>3.</w:t>
@@ -1619,7 +1619,7 @@
             </w:r>
             <w:r>
               <w:rPr>
-                <w:rStyle w:val="Hyperlink"/>
+                <w:rStyle w:val="Hipervnculo"/>
                 <w:noProof/>
               </w:rPr>
               <w:t>Using truth tables, establish the logic function for each circuit. Use Excel to generate a table for all variables.</w:t>
@@ -1643,7 +1643,7 @@
                 <w:noProof/>
                 <w:webHidden/>
               </w:rPr>
-              <w:instrText xml:space="preserve"> PAGEREF _Toc241949110 \h </w:instrText>
+              <w:instrText xml:space="preserve"> PAGEREF _Toc242299906 \h </w:instrText>
             </w:r>
             <w:r>
               <w:rPr>
@@ -1676,7 +1676,7 @@
         </w:p>
         <w:p>
           <w:pPr>
-            <w:pStyle w:val="TOC1"/>
+            <w:pStyle w:val="TDC1"/>
             <w:tabs>
               <w:tab w:val="right" w:leader="dot" w:pos="8494"/>
             </w:tabs>
@@ -1686,10 +1686,10 @@
               <w:lang w:val="es-ES" w:eastAsia="es-ES"/>
             </w:rPr>
           </w:pPr>
-          <w:hyperlink w:anchor="_Toc241949111" w:history="1">
-            <w:r>
-              <w:rPr>
-                <w:rStyle w:val="Hyperlink"/>
+          <w:hyperlink w:anchor="_Toc242299907" w:history="1">
+            <w:r>
+              <w:rPr>
+                <w:rStyle w:val="Hipervnculo"/>
                 <w:noProof/>
               </w:rPr>
               <w:t>Section 3</w:t>
@@ -1713,7 +1713,7 @@
                 <w:noProof/>
                 <w:webHidden/>
               </w:rPr>
-              <w:instrText xml:space="preserve"> PAGEREF _Toc241949111 \h </w:instrText>
+              <w:instrText xml:space="preserve"> PAGEREF _Toc242299907 \h </w:instrText>
             </w:r>
             <w:r>
               <w:rPr>
@@ -1746,7 +1746,7 @@
         </w:p>
         <w:p>
           <w:pPr>
-            <w:pStyle w:val="TOC2"/>
+            <w:pStyle w:val="TDC2"/>
             <w:tabs>
               <w:tab w:val="left" w:pos="720"/>
               <w:tab w:val="right" w:leader="dot" w:pos="8494"/>
@@ -1757,10 +1757,10 @@
               <w:lang w:val="es-ES" w:eastAsia="es-ES"/>
             </w:rPr>
           </w:pPr>
-          <w:hyperlink w:anchor="_Toc241949112" w:history="1">
-            <w:r>
-              <w:rPr>
-                <w:rStyle w:val="Hyperlink"/>
+          <w:hyperlink w:anchor="_Toc242299908" w:history="1">
+            <w:r>
+              <w:rPr>
+                <w:rStyle w:val="Hipervnculo"/>
                 <w:noProof/>
               </w:rPr>
               <w:t>1.</w:t>
@@ -1775,7 +1775,7 @@
             </w:r>
             <w:r>
               <w:rPr>
-                <w:rStyle w:val="Hyperlink"/>
+                <w:rStyle w:val="Hipervnculo"/>
                 <w:noProof/>
               </w:rPr>
               <w:t>Diagram</w:t>
@@ -1799,7 +1799,7 @@
                 <w:noProof/>
                 <w:webHidden/>
               </w:rPr>
-              <w:instrText xml:space="preserve"> PAGEREF _Toc241949112 \h </w:instrText>
+              <w:instrText xml:space="preserve"> PAGEREF _Toc242299908 \h </w:instrText>
             </w:r>
             <w:r>
               <w:rPr>
@@ -1832,7 +1832,7 @@
         </w:p>
         <w:p>
           <w:pPr>
-            <w:pStyle w:val="TOC2"/>
+            <w:pStyle w:val="TDC2"/>
             <w:tabs>
               <w:tab w:val="left" w:pos="720"/>
               <w:tab w:val="right" w:leader="dot" w:pos="8494"/>
@@ -1843,10 +1843,10 @@
               <w:lang w:val="es-ES" w:eastAsia="es-ES"/>
             </w:rPr>
           </w:pPr>
-          <w:hyperlink w:anchor="_Toc241949113" w:history="1">
-            <w:r>
-              <w:rPr>
-                <w:rStyle w:val="Hyperlink"/>
+          <w:hyperlink w:anchor="_Toc242299909" w:history="1">
+            <w:r>
+              <w:rPr>
+                <w:rStyle w:val="Hipervnculo"/>
                 <w:noProof/>
               </w:rPr>
               <w:t>2.</w:t>
@@ -1861,7 +1861,7 @@
             </w:r>
             <w:r>
               <w:rPr>
-                <w:rStyle w:val="Hyperlink"/>
+                <w:rStyle w:val="Hipervnculo"/>
                 <w:noProof/>
               </w:rPr>
               <w:t>PLC test unit</w:t>
@@ -1885,7 +1885,7 @@
                 <w:noProof/>
                 <w:webHidden/>
               </w:rPr>
-              <w:instrText xml:space="preserve"> PAGEREF _Toc241949113 \h </w:instrText>
+              <w:instrText xml:space="preserve"> PAGEREF _Toc242299909 \h </w:instrText>
             </w:r>
             <w:r>
               <w:rPr>
@@ -1905,7 +1905,7 @@
                 <w:noProof/>
                 <w:webHidden/>
               </w:rPr>
-              <w:t>8</w:t>
+              <w:t>9</w:t>
             </w:r>
             <w:r>
               <w:rPr>
@@ -1918,7 +1918,7 @@
         </w:p>
         <w:p>
           <w:pPr>
-            <w:pStyle w:val="TOC2"/>
+            <w:pStyle w:val="TDC2"/>
             <w:tabs>
               <w:tab w:val="left" w:pos="720"/>
               <w:tab w:val="right" w:leader="dot" w:pos="8494"/>
@@ -1929,10 +1929,10 @@
               <w:lang w:val="es-ES" w:eastAsia="es-ES"/>
             </w:rPr>
           </w:pPr>
-          <w:hyperlink w:anchor="_Toc241949114" w:history="1">
-            <w:r>
-              <w:rPr>
-                <w:rStyle w:val="Hyperlink"/>
+          <w:hyperlink w:anchor="_Toc242299910" w:history="1">
+            <w:r>
+              <w:rPr>
+                <w:rStyle w:val="Hipervnculo"/>
                 <w:noProof/>
               </w:rPr>
               <w:t>3.</w:t>
@@ -1947,10 +1947,10 @@
             </w:r>
             <w:r>
               <w:rPr>
-                <w:rStyle w:val="Hyperlink"/>
-                <w:noProof/>
-              </w:rPr>
-              <w:t>Wire the 3VDC motor using a control relay so that the motor operates with the ladder logic design. Hint: Two different voltages can be used to achieve the required result.</w:t>
+                <w:rStyle w:val="Hipervnculo"/>
+                <w:noProof/>
+              </w:rPr>
+              <w:t>Three-phase (415V) supply Diagram</w:t>
             </w:r>
             <w:r>
               <w:rPr>
@@ -1971,7 +1971,7 @@
                 <w:noProof/>
                 <w:webHidden/>
               </w:rPr>
-              <w:instrText xml:space="preserve"> PAGEREF _Toc241949114 \h </w:instrText>
+              <w:instrText xml:space="preserve"> PAGEREF _Toc242299910 \h </w:instrText>
             </w:r>
             <w:r>
               <w:rPr>
@@ -1991,7 +1991,7 @@
                 <w:noProof/>
                 <w:webHidden/>
               </w:rPr>
-              <w:t>8</w:t>
+              <w:t>10</w:t>
             </w:r>
             <w:r>
               <w:rPr>
@@ -2004,7 +2004,7 @@
         </w:p>
         <w:p>
           <w:pPr>
-            <w:pStyle w:val="TOC2"/>
+            <w:pStyle w:val="TDC2"/>
             <w:tabs>
               <w:tab w:val="left" w:pos="720"/>
               <w:tab w:val="right" w:leader="dot" w:pos="8494"/>
@@ -2015,10 +2015,10 @@
               <w:lang w:val="es-ES" w:eastAsia="es-ES"/>
             </w:rPr>
           </w:pPr>
-          <w:hyperlink w:anchor="_Toc241949115" w:history="1">
-            <w:r>
-              <w:rPr>
-                <w:rStyle w:val="Hyperlink"/>
+          <w:hyperlink w:anchor="_Toc242299911" w:history="1">
+            <w:r>
+              <w:rPr>
+                <w:rStyle w:val="Hipervnculo"/>
                 <w:noProof/>
               </w:rPr>
               <w:t>4.</w:t>
@@ -2033,10 +2033,10 @@
             </w:r>
             <w:r>
               <w:rPr>
-                <w:rStyle w:val="Hyperlink"/>
-                <w:noProof/>
-              </w:rPr>
-              <w:t>Three-phase (415V) supply Diagram</w:t>
+                <w:rStyle w:val="Hipervnculo"/>
+                <w:noProof/>
+              </w:rPr>
+              <w:t>Conclusion and Discussion of results</w:t>
             </w:r>
             <w:r>
               <w:rPr>
@@ -2057,7 +2057,7 @@
                 <w:noProof/>
                 <w:webHidden/>
               </w:rPr>
-              <w:instrText xml:space="preserve"> PAGEREF _Toc241949115 \h </w:instrText>
+              <w:instrText xml:space="preserve"> PAGEREF _Toc242299911 \h </w:instrText>
             </w:r>
             <w:r>
               <w:rPr>
@@ -2077,93 +2077,7 @@
                 <w:noProof/>
                 <w:webHidden/>
               </w:rPr>
-              <w:t>9</w:t>
-            </w:r>
-            <w:r>
-              <w:rPr>
-                <w:noProof/>
-                <w:webHidden/>
-              </w:rPr>
-              <w:fldChar w:fldCharType="end"/>
-            </w:r>
-          </w:hyperlink>
-        </w:p>
-        <w:p>
-          <w:pPr>
-            <w:pStyle w:val="TOC2"/>
-            <w:tabs>
-              <w:tab w:val="left" w:pos="720"/>
-              <w:tab w:val="right" w:leader="dot" w:pos="8494"/>
-            </w:tabs>
-            <w:rPr>
-              <w:rFonts w:eastAsiaTheme="minorEastAsia"/>
-              <w:noProof/>
-              <w:lang w:val="es-ES" w:eastAsia="es-ES"/>
-            </w:rPr>
-          </w:pPr>
-          <w:hyperlink w:anchor="_Toc241949116" w:history="1">
-            <w:r>
-              <w:rPr>
-                <w:rStyle w:val="Hyperlink"/>
-                <w:noProof/>
-              </w:rPr>
-              <w:t>5.</w:t>
-            </w:r>
-            <w:r>
-              <w:rPr>
-                <w:rFonts w:eastAsiaTheme="minorEastAsia"/>
-                <w:noProof/>
-                <w:lang w:val="es-ES" w:eastAsia="es-ES"/>
-              </w:rPr>
-              <w:tab/>
-            </w:r>
-            <w:r>
-              <w:rPr>
-                <w:rStyle w:val="Hyperlink"/>
-                <w:noProof/>
-              </w:rPr>
-              <w:t>Conclusion and Discussion of results</w:t>
-            </w:r>
-            <w:r>
-              <w:rPr>
-                <w:noProof/>
-                <w:webHidden/>
-              </w:rPr>
-              <w:tab/>
-            </w:r>
-            <w:r>
-              <w:rPr>
-                <w:noProof/>
-                <w:webHidden/>
-              </w:rPr>
-              <w:fldChar w:fldCharType="begin"/>
-            </w:r>
-            <w:r>
-              <w:rPr>
-                <w:noProof/>
-                <w:webHidden/>
-              </w:rPr>
-              <w:instrText xml:space="preserve"> PAGEREF _Toc241949116 \h </w:instrText>
-            </w:r>
-            <w:r>
-              <w:rPr>
-                <w:noProof/>
-                <w:webHidden/>
-              </w:rPr>
-            </w:r>
-            <w:r>
-              <w:rPr>
-                <w:noProof/>
-                <w:webHidden/>
-              </w:rPr>
-              <w:fldChar w:fldCharType="separate"/>
-            </w:r>
-            <w:r>
-              <w:rPr>
-                <w:noProof/>
-                <w:webHidden/>
-              </w:rPr>
-              <w:t>9</w:t>
+              <w:t>10</w:t>
             </w:r>
             <w:r>
               <w:rPr>
@@ -2192,10 +2106,10 @@
     </w:p>
     <w:p>
       <w:pPr>
-        <w:pStyle w:val="Heading1"/>
+        <w:pStyle w:val="Ttulo1"/>
         <w:ind w:left="0" w:firstLine="0"/>
       </w:pPr>
-      <w:bookmarkStart w:id="0" w:name="_Toc241949097"/>
+      <w:bookmarkStart w:id="0" w:name="_Toc242299893"/>
       <w:r>
         <w:lastRenderedPageBreak/>
         <w:t>Section 1 – Mitsubishi Test Kit Analysis</w:t>
@@ -2205,13 +2119,13 @@
     <w:p/>
     <w:p>
       <w:pPr>
-        <w:pStyle w:val="Heading2"/>
+        <w:pStyle w:val="Ttulo2"/>
         <w:numPr>
           <w:ilvl w:val="0"/>
           <w:numId w:val="4"/>
         </w:numPr>
       </w:pPr>
-      <w:bookmarkStart w:id="1" w:name="_Toc241949098"/>
+      <w:bookmarkStart w:id="1" w:name="_Toc242299894"/>
       <w:r>
         <w:t>Mitsubishi FX3G PLC Sketch</w:t>
       </w:r>
@@ -2288,13 +2202,13 @@
     </w:p>
     <w:p>
       <w:pPr>
-        <w:pStyle w:val="Heading2"/>
+        <w:pStyle w:val="Ttulo2"/>
         <w:numPr>
           <w:ilvl w:val="0"/>
           <w:numId w:val="4"/>
         </w:numPr>
       </w:pPr>
-      <w:bookmarkStart w:id="2" w:name="_Toc241949099"/>
+      <w:bookmarkStart w:id="2" w:name="_Toc242299895"/>
       <w:r>
         <w:t xml:space="preserve">Define the difference between </w:t>
       </w:r>
@@ -2356,13 +2270,13 @@
     </w:p>
     <w:p>
       <w:pPr>
-        <w:pStyle w:val="Heading2"/>
+        <w:pStyle w:val="Ttulo2"/>
         <w:numPr>
           <w:ilvl w:val="0"/>
           <w:numId w:val="4"/>
         </w:numPr>
       </w:pPr>
-      <w:bookmarkStart w:id="3" w:name="_Toc241949100"/>
+      <w:bookmarkStart w:id="3" w:name="_Toc242299896"/>
       <w:r>
         <w:t>Troubleshooting potential electrical fault</w:t>
       </w:r>
@@ -2413,9 +2327,9 @@
     <w:p/>
     <w:p>
       <w:pPr>
-        <w:pStyle w:val="Heading1"/>
-      </w:pPr>
-      <w:bookmarkStart w:id="4" w:name="_Toc241949101"/>
+        <w:pStyle w:val="Ttulo1"/>
+      </w:pPr>
+      <w:bookmarkStart w:id="4" w:name="_Toc242299897"/>
       <w:r>
         <w:t>Section 2 – Truth Table Analysis</w:t>
       </w:r>
@@ -2424,13 +2338,13 @@
     <w:p/>
     <w:p>
       <w:pPr>
-        <w:pStyle w:val="Heading2"/>
+        <w:pStyle w:val="Ttulo2"/>
         <w:numPr>
           <w:ilvl w:val="0"/>
           <w:numId w:val="6"/>
         </w:numPr>
       </w:pPr>
-      <w:bookmarkStart w:id="5" w:name="_Toc241949102"/>
+      <w:bookmarkStart w:id="5" w:name="_Toc242299898"/>
       <w:r>
         <w:t>Construct a ladder diagram for each of the circuits shown below. Create a new diagram for each circuit.</w:t>
       </w:r>
@@ -2438,13 +2352,13 @@
     </w:p>
     <w:p>
       <w:pPr>
-        <w:pStyle w:val="Heading2"/>
+        <w:pStyle w:val="Ttulo2"/>
         <w:numPr>
           <w:ilvl w:val="0"/>
           <w:numId w:val="6"/>
         </w:numPr>
       </w:pPr>
-      <w:bookmarkStart w:id="6" w:name="_Toc241949103"/>
+      <w:bookmarkStart w:id="6" w:name="_Toc242299899"/>
       <w:r>
         <w:t>Test the ladder logic to ensure there are no errors or warnings.</w:t>
       </w:r>
@@ -2453,7 +2367,7 @@
     <w:p/>
     <w:p>
       <w:pPr>
-        <w:pStyle w:val="ListNumber"/>
+        <w:pStyle w:val="Listaconnmeros"/>
         <w:numPr>
           <w:ilvl w:val="0"/>
           <w:numId w:val="0"/>
@@ -2466,9 +2380,9 @@
     </w:p>
     <w:p>
       <w:pPr>
-        <w:pStyle w:val="Heading3"/>
-      </w:pPr>
-      <w:bookmarkStart w:id="7" w:name="_Toc241949104"/>
+        <w:pStyle w:val="Ttulo3"/>
+      </w:pPr>
+      <w:bookmarkStart w:id="7" w:name="_Toc242299900"/>
       <w:r>
         <w:t>Circuit a:</w:t>
       </w:r>
@@ -2522,7 +2436,7 @@
     </w:p>
     <w:p>
       <w:pPr>
-        <w:pStyle w:val="Caption"/>
+        <w:pStyle w:val="Descripcin"/>
         <w:jc w:val="center"/>
       </w:pPr>
       <w:r>
@@ -2601,7 +2515,7 @@
     </w:p>
     <w:p>
       <w:pPr>
-        <w:pStyle w:val="Caption"/>
+        <w:pStyle w:val="Descripcin"/>
         <w:jc w:val="center"/>
       </w:pPr>
       <w:r>
@@ -2632,9 +2546,9 @@
     <w:p/>
     <w:p>
       <w:pPr>
-        <w:pStyle w:val="Heading3"/>
-      </w:pPr>
-      <w:bookmarkStart w:id="8" w:name="_Toc241949105"/>
+        <w:pStyle w:val="Ttulo3"/>
+      </w:pPr>
+      <w:bookmarkStart w:id="8" w:name="_Toc242299901"/>
       <w:r>
         <w:t>Circuit b:</w:t>
       </w:r>
@@ -2688,7 +2602,7 @@
     </w:p>
     <w:p>
       <w:pPr>
-        <w:pStyle w:val="Caption"/>
+        <w:pStyle w:val="Descripcin"/>
         <w:jc w:val="center"/>
       </w:pPr>
       <w:r>
@@ -2765,7 +2679,7 @@
     </w:p>
     <w:p>
       <w:pPr>
-        <w:pStyle w:val="Caption"/>
+        <w:pStyle w:val="Descripcin"/>
         <w:jc w:val="center"/>
       </w:pPr>
       <w:r>
@@ -2797,9 +2711,9 @@
     <w:p/>
     <w:p>
       <w:pPr>
-        <w:pStyle w:val="Heading3"/>
-      </w:pPr>
-      <w:bookmarkStart w:id="9" w:name="_Toc241949106"/>
+        <w:pStyle w:val="Ttulo3"/>
+      </w:pPr>
+      <w:bookmarkStart w:id="9" w:name="_Toc242299902"/>
       <w:r>
         <w:lastRenderedPageBreak/>
         <w:t>Circuit c:</w:t>
@@ -2854,7 +2768,7 @@
     </w:p>
     <w:p>
       <w:pPr>
-        <w:pStyle w:val="Caption"/>
+        <w:pStyle w:val="Descripcin"/>
         <w:jc w:val="center"/>
       </w:pPr>
       <w:r>
@@ -2931,7 +2845,7 @@
     </w:p>
     <w:p>
       <w:pPr>
-        <w:pStyle w:val="Caption"/>
+        <w:pStyle w:val="Descripcin"/>
         <w:jc w:val="center"/>
         <w:rPr>
           <w:lang w:val="en-US"/>
@@ -2966,9 +2880,9 @@
     <w:p/>
     <w:p>
       <w:pPr>
-        <w:pStyle w:val="Heading3"/>
-      </w:pPr>
-      <w:bookmarkStart w:id="10" w:name="_Toc241949107"/>
+        <w:pStyle w:val="Ttulo3"/>
+      </w:pPr>
+      <w:bookmarkStart w:id="10" w:name="_Toc242299903"/>
       <w:r>
         <w:t>Circuit d:</w:t>
       </w:r>
@@ -3022,7 +2936,7 @@
     </w:p>
     <w:p>
       <w:pPr>
-        <w:pStyle w:val="Caption"/>
+        <w:pStyle w:val="Descripcin"/>
         <w:jc w:val="center"/>
       </w:pPr>
       <w:r>
@@ -3099,7 +3013,7 @@
     </w:p>
     <w:p>
       <w:pPr>
-        <w:pStyle w:val="Caption"/>
+        <w:pStyle w:val="Descripcin"/>
         <w:jc w:val="center"/>
       </w:pPr>
       <w:r>
@@ -3130,9 +3044,9 @@
     <w:p/>
     <w:p>
       <w:pPr>
-        <w:pStyle w:val="Heading3"/>
-      </w:pPr>
-      <w:bookmarkStart w:id="11" w:name="_Toc241949108"/>
+        <w:pStyle w:val="Ttulo3"/>
+      </w:pPr>
+      <w:bookmarkStart w:id="11" w:name="_Toc242299904"/>
       <w:r>
         <w:t>Circuit e:</w:t>
       </w:r>
@@ -3186,7 +3100,7 @@
     </w:p>
     <w:p>
       <w:pPr>
-        <w:pStyle w:val="Caption"/>
+        <w:pStyle w:val="Descripcin"/>
         <w:jc w:val="center"/>
       </w:pPr>
       <w:r>
@@ -3262,7 +3176,7 @@
     </w:p>
     <w:p>
       <w:pPr>
-        <w:pStyle w:val="Caption"/>
+        <w:pStyle w:val="Descripcin"/>
         <w:jc w:val="center"/>
       </w:pPr>
       <w:r>
@@ -3292,9 +3206,9 @@
     </w:p>
     <w:p>
       <w:pPr>
-        <w:pStyle w:val="Heading3"/>
-      </w:pPr>
-      <w:bookmarkStart w:id="12" w:name="_Toc241949109"/>
+        <w:pStyle w:val="Ttulo3"/>
+      </w:pPr>
+      <w:bookmarkStart w:id="12" w:name="_Toc242299905"/>
       <w:r>
         <w:lastRenderedPageBreak/>
         <w:t>Circuit f:</w:t>
@@ -3349,7 +3263,7 @@
     </w:p>
     <w:p>
       <w:pPr>
-        <w:pStyle w:val="Caption"/>
+        <w:pStyle w:val="Descripcin"/>
         <w:jc w:val="center"/>
       </w:pPr>
       <w:r>
@@ -3425,7 +3339,7 @@
     </w:p>
     <w:p>
       <w:pPr>
-        <w:pStyle w:val="Caption"/>
+        <w:pStyle w:val="Descripcin"/>
         <w:jc w:val="center"/>
       </w:pPr>
       <w:r>
@@ -3455,36 +3369,109 @@
     </w:p>
     <w:p>
       <w:pPr>
-        <w:pStyle w:val="Heading2"/>
+        <w:pStyle w:val="Ttulo2"/>
         <w:numPr>
           <w:ilvl w:val="0"/>
           <w:numId w:val="6"/>
         </w:numPr>
       </w:pPr>
-      <w:bookmarkStart w:id="13" w:name="_Toc241949110"/>
+      <w:bookmarkStart w:id="13" w:name="_Toc242299906"/>
       <w:r>
         <w:t>Using truth tables, establish the logic function for each circuit. Use Excel to generate a table for all variables.</w:t>
       </w:r>
       <w:bookmarkEnd w:id="13"/>
     </w:p>
-    <w:p/>
     <w:p>
       <w:r>
-        <w:t xml:space="preserve">See Excel file </w:t>
-      </w:r>
-      <w:r>
-        <w:t>a</w:t>
-      </w:r>
-      <w:r>
-        <w:t>ttached in the submission.</w:t>
+        <w:t>See e</w:t>
+      </w:r>
+      <w:r>
+        <w:t>x</w:t>
+      </w:r>
+      <w:r>
+        <w:t>cel document attached.</w:t>
       </w:r>
     </w:p>
-    <w:p/>
     <w:p>
       <w:pPr>
-        <w:pStyle w:val="Heading1"/>
-      </w:pPr>
-      <w:bookmarkStart w:id="14" w:name="_Toc241949111"/>
+        <w:keepNext/>
+      </w:pPr>
+      <w:r>
+        <w:rPr>
+          <w:noProof/>
+        </w:rPr>
+        <w:drawing>
+          <wp:inline distT="0" distB="0" distL="0" distR="0" wp14:anchorId="1781B777" wp14:editId="36F9B30F">
+            <wp:extent cx="5400040" cy="1621790"/>
+            <wp:effectExtent l="0" t="0" r="0" b="0"/>
+            <wp:docPr id="81479584" name="Imagen 1"/>
+            <wp:cNvGraphicFramePr>
+              <a:graphicFrameLocks xmlns:a="http://schemas.openxmlformats.org/drawingml/2006/main" noChangeAspect="1"/>
+            </wp:cNvGraphicFramePr>
+            <a:graphic xmlns:a="http://schemas.openxmlformats.org/drawingml/2006/main">
+              <a:graphicData uri="http://schemas.openxmlformats.org/drawingml/2006/picture">
+                <pic:pic xmlns:pic="http://schemas.openxmlformats.org/drawingml/2006/picture">
+                  <pic:nvPicPr>
+                    <pic:cNvPr id="81479584" name=""/>
+                    <pic:cNvPicPr/>
+                  </pic:nvPicPr>
+                  <pic:blipFill>
+                    <a:blip r:embed="rId22"/>
+                    <a:stretch>
+                      <a:fillRect/>
+                    </a:stretch>
+                  </pic:blipFill>
+                  <pic:spPr>
+                    <a:xfrm>
+                      <a:off x="0" y="0"/>
+                      <a:ext cx="5400040" cy="1621790"/>
+                    </a:xfrm>
+                    <a:prstGeom prst="rect">
+                      <a:avLst/>
+                    </a:prstGeom>
+                  </pic:spPr>
+                </pic:pic>
+              </a:graphicData>
+            </a:graphic>
+          </wp:inline>
+        </w:drawing>
+      </w:r>
+    </w:p>
+    <w:p>
+      <w:pPr>
+        <w:pStyle w:val="Descripcin"/>
+        <w:jc w:val="center"/>
+      </w:pPr>
+      <w:r>
+        <w:t xml:space="preserve">Figure </w:t>
+      </w:r>
+      <w:r>
+        <w:fldChar w:fldCharType="begin"/>
+      </w:r>
+      <w:r>
+        <w:instrText xml:space="preserve"> SEQ Figure \* ARABIC </w:instrText>
+      </w:r>
+      <w:r>
+        <w:fldChar w:fldCharType="separate"/>
+      </w:r>
+      <w:r>
+        <w:rPr>
+          <w:noProof/>
+        </w:rPr>
+        <w:t>13</w:t>
+      </w:r>
+      <w:r>
+        <w:fldChar w:fldCharType="end"/>
+      </w:r>
+      <w:r>
+        <w:t xml:space="preserve"> Truth tables</w:t>
+      </w:r>
+    </w:p>
+    <w:p>
+      <w:pPr>
+        <w:pStyle w:val="Ttulo1"/>
+      </w:pPr>
+      <w:bookmarkStart w:id="14" w:name="_Toc242299907"/>
       <w:r>
         <w:lastRenderedPageBreak/>
         <w:t>Section 3</w:t>
@@ -3493,13 +3480,13 @@
     </w:p>
     <w:p>
       <w:pPr>
-        <w:pStyle w:val="Heading2"/>
+        <w:pStyle w:val="Ttulo2"/>
         <w:numPr>
           <w:ilvl w:val="0"/>
           <w:numId w:val="7"/>
         </w:numPr>
       </w:pPr>
-      <w:bookmarkStart w:id="15" w:name="_Toc241949112"/>
+      <w:bookmarkStart w:id="15" w:name="_Toc242299908"/>
       <w:r>
         <w:t>Diagram</w:t>
       </w:r>
@@ -3530,7 +3517,7 @@
                     <pic:cNvPicPr/>
                   </pic:nvPicPr>
                   <pic:blipFill>
-                    <a:blip r:embed="rId22"/>
+                    <a:blip r:embed="rId23"/>
                     <a:stretch>
                       <a:fillRect/>
                     </a:stretch>
@@ -3553,7 +3540,7 @@
     </w:p>
     <w:p>
       <w:pPr>
-        <w:pStyle w:val="Caption"/>
+        <w:pStyle w:val="Descripcin"/>
         <w:jc w:val="center"/>
       </w:pPr>
       <w:r>
@@ -3572,7 +3559,7 @@
         <w:rPr>
           <w:noProof/>
         </w:rPr>
-        <w:t>13</w:t>
+        <w:t>14</w:t>
       </w:r>
       <w:r>
         <w:fldChar w:fldCharType="end"/>
@@ -3606,7 +3593,7 @@
                     <pic:cNvPicPr/>
                   </pic:nvPicPr>
                   <pic:blipFill>
-                    <a:blip r:embed="rId23"/>
+                    <a:blip r:embed="rId24"/>
                     <a:stretch>
                       <a:fillRect/>
                     </a:stretch>
@@ -3629,7 +3616,7 @@
     </w:p>
     <w:p>
       <w:pPr>
-        <w:pStyle w:val="Caption"/>
+        <w:pStyle w:val="Descripcin"/>
         <w:jc w:val="center"/>
       </w:pPr>
       <w:r>
@@ -3648,7 +3635,7 @@
         <w:rPr>
           <w:noProof/>
         </w:rPr>
-        <w:t>14</w:t>
+        <w:t>15</w:t>
       </w:r>
       <w:r>
         <w:fldChar w:fldCharType="end"/>
@@ -3659,28 +3646,980 @@
     </w:p>
     <w:p>
       <w:pPr>
-        <w:pStyle w:val="Heading2"/>
+        <w:pStyle w:val="Ttulo2"/>
         <w:numPr>
           <w:ilvl w:val="0"/>
           <w:numId w:val="7"/>
         </w:numPr>
       </w:pPr>
-      <w:bookmarkStart w:id="16" w:name="_Toc241949113"/>
-      <w:r>
+      <w:bookmarkStart w:id="16" w:name="_Toc242299909"/>
+      <w:r>
+        <w:lastRenderedPageBreak/>
         <w:t>PLC test unit</w:t>
       </w:r>
       <w:bookmarkEnd w:id="16"/>
+    </w:p>
+    <w:p>
+      <w:pPr>
+        <w:keepNext/>
+        <w:jc w:val="center"/>
+      </w:pPr>
+      <w:r>
+        <w:rPr>
+          <w:noProof/>
+        </w:rPr>
+        <mc:AlternateContent>
+          <mc:Choice Requires="wps">
+            <w:drawing>
+              <wp:anchor distT="0" distB="0" distL="114300" distR="114300" simplePos="0" relativeHeight="251661312" behindDoc="0" locked="0" layoutInCell="1" allowOverlap="1" wp14:anchorId="40DDC927" wp14:editId="50D7135C">
+                <wp:simplePos x="0" y="0"/>
+                <wp:positionH relativeFrom="column">
+                  <wp:posOffset>5068228</wp:posOffset>
+                </wp:positionH>
+                <wp:positionV relativeFrom="paragraph">
+                  <wp:posOffset>621470</wp:posOffset>
+                </wp:positionV>
+                <wp:extent cx="1280160" cy="715107"/>
+                <wp:effectExtent l="0" t="0" r="15240" b="27940"/>
+                <wp:wrapNone/>
+                <wp:docPr id="276747421" name="Cuadro de texto 4"/>
+                <wp:cNvGraphicFramePr/>
+                <a:graphic xmlns:a="http://schemas.openxmlformats.org/drawingml/2006/main">
+                  <a:graphicData uri="http://schemas.microsoft.com/office/word/2010/wordprocessingShape">
+                    <wps:wsp>
+                      <wps:cNvSpPr txBox="1"/>
+                      <wps:spPr>
+                        <a:xfrm>
+                          <a:off x="0" y="0"/>
+                          <a:ext cx="1280160" cy="715107"/>
+                        </a:xfrm>
+                        <a:prstGeom prst="rect">
+                          <a:avLst/>
+                        </a:prstGeom>
+                        <a:solidFill>
+                          <a:schemeClr val="lt1"/>
+                        </a:solidFill>
+                        <a:ln w="6350">
+                          <a:solidFill>
+                            <a:prstClr val="black"/>
+                          </a:solidFill>
+                        </a:ln>
+                      </wps:spPr>
+                      <wps:txbx>
+                        <w:txbxContent>
+                          <w:p>
+                            <w:pPr>
+                              <w:jc w:val="center"/>
+                            </w:pPr>
+                            <w:r>
+                              <w:t xml:space="preserve">Y0 (motor) </w:t>
+                            </w:r>
+                            <w:r>
+                              <w:t xml:space="preserve">is off and Y2 </w:t>
+                            </w:r>
+                            <w:r>
+                              <w:t>(red LED)</w:t>
+                            </w:r>
+                            <w:r>
+                              <w:t xml:space="preserve"> </w:t>
+                            </w:r>
+                            <w:r>
+                              <w:t>is on</w:t>
+                            </w:r>
+                          </w:p>
+                        </w:txbxContent>
+                      </wps:txbx>
+                      <wps:bodyPr rot="0" spcFirstLastPara="0" vertOverflow="overflow" horzOverflow="overflow" vert="horz" wrap="square" lIns="91440" tIns="45720" rIns="91440" bIns="45720" numCol="1" spcCol="0" rtlCol="0" fromWordArt="0" anchor="t" anchorCtr="0" forceAA="0" compatLnSpc="1">
+                        <a:prstTxWarp prst="textNoShape">
+                          <a:avLst/>
+                        </a:prstTxWarp>
+                        <a:noAutofit/>
+                      </wps:bodyPr>
+                    </wps:wsp>
+                  </a:graphicData>
+                </a:graphic>
+                <wp14:sizeRelV relativeFrom="margin">
+                  <wp14:pctHeight>0</wp14:pctHeight>
+                </wp14:sizeRelV>
+              </wp:anchor>
+            </w:drawing>
+          </mc:Choice>
+          <mc:Fallback>
+            <w:pict>
+              <v:shape w14:anchorId="40DDC927" id="Cuadro de texto 4" o:spid="_x0000_s1027" type="#_x0000_t202" style="position:absolute;left:0;text-align:left;margin-left:399.05pt;margin-top:48.95pt;width:100.8pt;height:56.3pt;z-index:251661312;visibility:visible;mso-wrap-style:square;mso-height-percent:0;mso-wrap-distance-left:9pt;mso-wrap-distance-top:0;mso-wrap-distance-right:9pt;mso-wrap-distance-bottom:0;mso-position-horizontal:absolute;mso-position-horizontal-relative:text;mso-position-vertical:absolute;mso-position-vertical-relative:text;mso-height-percent:0;mso-height-relative:margin;v-text-anchor:top" o:gfxdata="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" fillcolor="white [3201]" strokeweight=".5pt">
+                <v:textbox>
+                  <w:txbxContent>
+                    <w:p>
+                      <w:pPr>
+                        <w:jc w:val="center"/>
+                      </w:pPr>
+                      <w:r>
+                        <w:t xml:space="preserve">Y0 (motor) </w:t>
+                      </w:r>
+                      <w:r>
+                        <w:t xml:space="preserve">is off and Y2 </w:t>
+                      </w:r>
+                      <w:r>
+                        <w:t>(red LED)</w:t>
+                      </w:r>
+                      <w:r>
+                        <w:t xml:space="preserve"> </w:t>
+                      </w:r>
+                      <w:r>
+                        <w:t>is on</w:t>
+                      </w:r>
+                    </w:p>
+                  </w:txbxContent>
+                </v:textbox>
+              </v:shape>
+            </w:pict>
+          </mc:Fallback>
+        </mc:AlternateContent>
+      </w:r>
+      <w:r>
+        <w:rPr>
+          <w:noProof/>
+        </w:rPr>
+        <mc:AlternateContent>
+          <mc:Choice Requires="wps">
+            <w:drawing>
+              <wp:anchor distT="0" distB="0" distL="114300" distR="114300" simplePos="0" relativeHeight="251663360" behindDoc="0" locked="0" layoutInCell="1" allowOverlap="1" wp14:anchorId="0C5C1200" wp14:editId="0582FB9C">
+                <wp:simplePos x="0" y="0"/>
+                <wp:positionH relativeFrom="column">
+                  <wp:posOffset>-728393</wp:posOffset>
+                </wp:positionH>
+                <wp:positionV relativeFrom="paragraph">
+                  <wp:posOffset>2210289</wp:posOffset>
+                </wp:positionV>
+                <wp:extent cx="990600" cy="486507"/>
+                <wp:effectExtent l="0" t="0" r="19050" b="27940"/>
+                <wp:wrapNone/>
+                <wp:docPr id="1956452859" name="Cuadro de texto 6"/>
+                <wp:cNvGraphicFramePr/>
+                <a:graphic xmlns:a="http://schemas.openxmlformats.org/drawingml/2006/main">
+                  <a:graphicData uri="http://schemas.microsoft.com/office/word/2010/wordprocessingShape">
+                    <wps:wsp>
+                      <wps:cNvSpPr txBox="1"/>
+                      <wps:spPr>
+                        <a:xfrm>
+                          <a:off x="0" y="0"/>
+                          <a:ext cx="990600" cy="486507"/>
+                        </a:xfrm>
+                        <a:prstGeom prst="rect">
+                          <a:avLst/>
+                        </a:prstGeom>
+                        <a:solidFill>
+                          <a:schemeClr val="lt1"/>
+                        </a:solidFill>
+                        <a:ln w="6350">
+                          <a:solidFill>
+                            <a:prstClr val="black"/>
+                          </a:solidFill>
+                        </a:ln>
+                      </wps:spPr>
+                      <wps:txbx>
+                        <w:txbxContent>
+                          <w:p>
+                            <w:pPr>
+                              <w:jc w:val="center"/>
+                              <w:rPr>
+                                <w:lang w:val="es-ES"/>
+                              </w:rPr>
+                            </w:pPr>
+                            <w:r>
+                              <w:rPr>
+                                <w:lang w:val="es-ES"/>
+                              </w:rPr>
+                              <w:t xml:space="preserve">X0 switch </w:t>
+                            </w:r>
+                            <w:proofErr w:type="spellStart"/>
+                            <w:r>
+                              <w:rPr>
+                                <w:lang w:val="es-ES"/>
+                              </w:rPr>
+                              <w:t>is</w:t>
+                            </w:r>
+                            <w:proofErr w:type="spellEnd"/>
+                            <w:r>
+                              <w:rPr>
+                                <w:lang w:val="es-ES"/>
+                              </w:rPr>
+                              <w:t xml:space="preserve"> </w:t>
+                            </w:r>
+                            <w:proofErr w:type="spellStart"/>
+                            <w:r>
+                              <w:rPr>
+                                <w:lang w:val="es-ES"/>
+                              </w:rPr>
+                              <w:t>low</w:t>
+                            </w:r>
+                            <w:proofErr w:type="spellEnd"/>
+                          </w:p>
+                        </w:txbxContent>
+                      </wps:txbx>
+                      <wps:bodyPr rot="0" spcFirstLastPara="0" vertOverflow="overflow" horzOverflow="overflow" vert="horz" wrap="square" lIns="91440" tIns="45720" rIns="91440" bIns="45720" numCol="1" spcCol="0" rtlCol="0" fromWordArt="0" anchor="t" anchorCtr="0" forceAA="0" compatLnSpc="1">
+                        <a:prstTxWarp prst="textNoShape">
+                          <a:avLst/>
+                        </a:prstTxWarp>
+                        <a:noAutofit/>
+                      </wps:bodyPr>
+                    </wps:wsp>
+                  </a:graphicData>
+                </a:graphic>
+                <wp14:sizeRelV relativeFrom="margin">
+                  <wp14:pctHeight>0</wp14:pctHeight>
+                </wp14:sizeRelV>
+              </wp:anchor>
+            </w:drawing>
+          </mc:Choice>
+          <mc:Fallback>
+            <w:pict>
+              <v:shape w14:anchorId="0C5C1200" id="Cuadro de texto 6" o:spid="_x0000_s1028" type="#_x0000_t202" style="position:absolute;left:0;text-align:left;margin-left:-57.35pt;margin-top:174.05pt;width:78pt;height:38.3pt;z-index:251663360;visibility:visible;mso-wrap-style:square;mso-height-percent:0;mso-wrap-distance-left:9pt;mso-wrap-distance-top:0;mso-wrap-distance-right:9pt;mso-wrap-distance-bottom:0;mso-position-horizontal:absolute;mso-position-horizontal-relative:text;mso-position-vertical:absolute;mso-position-vertical-relative:text;mso-height-percent:0;mso-height-relative:margin;v-text-anchor:top" o:gfxdata="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" fillcolor="white [3201]" strokeweight=".5pt">
+                <v:textbox>
+                  <w:txbxContent>
+                    <w:p>
+                      <w:pPr>
+                        <w:jc w:val="center"/>
+                        <w:rPr>
+                          <w:lang w:val="es-ES"/>
+                        </w:rPr>
+                      </w:pPr>
+                      <w:r>
+                        <w:rPr>
+                          <w:lang w:val="es-ES"/>
+                        </w:rPr>
+                        <w:t xml:space="preserve">X0 switch </w:t>
+                      </w:r>
+                      <w:proofErr w:type="spellStart"/>
+                      <w:r>
+                        <w:rPr>
+                          <w:lang w:val="es-ES"/>
+                        </w:rPr>
+                        <w:t>is</w:t>
+                      </w:r>
+                      <w:proofErr w:type="spellEnd"/>
+                      <w:r>
+                        <w:rPr>
+                          <w:lang w:val="es-ES"/>
+                        </w:rPr>
+                        <w:t xml:space="preserve"> </w:t>
+                      </w:r>
+                      <w:proofErr w:type="spellStart"/>
+                      <w:r>
+                        <w:rPr>
+                          <w:lang w:val="es-ES"/>
+                        </w:rPr>
+                        <w:t>low</w:t>
+                      </w:r>
+                      <w:proofErr w:type="spellEnd"/>
+                    </w:p>
+                  </w:txbxContent>
+                </v:textbox>
+              </v:shape>
+            </w:pict>
+          </mc:Fallback>
+        </mc:AlternateContent>
+      </w:r>
+      <w:r>
+        <w:rPr>
+          <w:noProof/>
+        </w:rPr>
+        <mc:AlternateContent>
+          <mc:Choice Requires="wps">
+            <w:drawing>
+              <wp:anchor distT="0" distB="0" distL="114300" distR="114300" simplePos="0" relativeHeight="251662336" behindDoc="0" locked="0" layoutInCell="1" allowOverlap="1" wp14:anchorId="7314B6BC" wp14:editId="36E7F469">
+                <wp:simplePos x="0" y="0"/>
+                <wp:positionH relativeFrom="column">
+                  <wp:posOffset>326633</wp:posOffset>
+                </wp:positionH>
+                <wp:positionV relativeFrom="paragraph">
+                  <wp:posOffset>2532771</wp:posOffset>
+                </wp:positionV>
+                <wp:extent cx="1084385" cy="369277"/>
+                <wp:effectExtent l="0" t="0" r="59055" b="69215"/>
+                <wp:wrapNone/>
+                <wp:docPr id="1403746163" name="Conector recto de flecha 5"/>
+                <wp:cNvGraphicFramePr/>
+                <a:graphic xmlns:a="http://schemas.openxmlformats.org/drawingml/2006/main">
+                  <a:graphicData uri="http://schemas.microsoft.com/office/word/2010/wordprocessingShape">
+                    <wps:wsp>
+                      <wps:cNvCnPr/>
+                      <wps:spPr>
+                        <a:xfrm>
+                          <a:off x="0" y="0"/>
+                          <a:ext cx="1084385" cy="369277"/>
+                        </a:xfrm>
+                        <a:prstGeom prst="straightConnector1">
+                          <a:avLst/>
+                        </a:prstGeom>
+                        <a:ln>
+                          <a:solidFill>
+                            <a:srgbClr val="EE0000"/>
+                          </a:solidFill>
+                          <a:tailEnd type="triangle"/>
+                        </a:ln>
+                      </wps:spPr>
+                      <wps:style>
+                        <a:lnRef idx="2">
+                          <a:schemeClr val="accent1"/>
+                        </a:lnRef>
+                        <a:fillRef idx="0">
+                          <a:schemeClr val="accent1"/>
+                        </a:fillRef>
+                        <a:effectRef idx="1">
+                          <a:schemeClr val="accent1"/>
+                        </a:effectRef>
+                        <a:fontRef idx="minor">
+                          <a:schemeClr val="tx1"/>
+                        </a:fontRef>
+                      </wps:style>
+                      <wps:bodyPr/>
+                    </wps:wsp>
+                  </a:graphicData>
+                </a:graphic>
+              </wp:anchor>
+            </w:drawing>
+          </mc:Choice>
+          <mc:Fallback>
+            <w:pict>
+              <v:shapetype w14:anchorId="063B4501" id="_x0000_t32" coordsize="21600,21600" o:spt="32" o:oned="t" path="m,l21600,21600e" filled="f">
+                <v:path arrowok="t" fillok="f" o:connecttype="none"/>
+                <o:lock v:ext="edit" shapetype="t"/>
+              </v:shapetype>
+              <v:shape id="Conector recto de flecha 5" o:spid="_x0000_s1026" type="#_x0000_t32" style="position:absolute;margin-left:25.7pt;margin-top:199.45pt;width:85.4pt;height:29.1pt;z-index:251662336;visibility:visible;mso-wrap-style:square;mso-wrap-distance-left:9pt;mso-wrap-distance-top:0;mso-wrap-distance-right:9pt;mso-wrap-distance-bottom:0;mso-position-horizontal:absolute;mso-position-horizontal-relative:text;mso-position-vertical:absolute;mso-position-vertical-relative:text" o:gfxdata="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" strokecolor="#e00" strokeweight="1.5pt">
+                <v:stroke endarrow="block" joinstyle="miter"/>
+              </v:shape>
+            </w:pict>
+          </mc:Fallback>
+        </mc:AlternateContent>
+      </w:r>
+      <w:r>
+        <w:rPr>
+          <w:noProof/>
+        </w:rPr>
+        <mc:AlternateContent>
+          <mc:Choice Requires="wps">
+            <w:drawing>
+              <wp:anchor distT="0" distB="0" distL="114300" distR="114300" simplePos="0" relativeHeight="251660288" behindDoc="0" locked="0" layoutInCell="1" allowOverlap="1" wp14:anchorId="005F513B" wp14:editId="5CB7858B">
+                <wp:simplePos x="0" y="0"/>
+                <wp:positionH relativeFrom="column">
+                  <wp:posOffset>3923664</wp:posOffset>
+                </wp:positionH>
+                <wp:positionV relativeFrom="paragraph">
+                  <wp:posOffset>959273</wp:posOffset>
+                </wp:positionV>
+                <wp:extent cx="1067647" cy="55034"/>
+                <wp:effectExtent l="38100" t="19050" r="18415" b="97790"/>
+                <wp:wrapNone/>
+                <wp:docPr id="1394171919" name="Conector recto de flecha 3"/>
+                <wp:cNvGraphicFramePr/>
+                <a:graphic xmlns:a="http://schemas.openxmlformats.org/drawingml/2006/main">
+                  <a:graphicData uri="http://schemas.microsoft.com/office/word/2010/wordprocessingShape">
+                    <wps:wsp>
+                      <wps:cNvCnPr/>
+                      <wps:spPr>
+                        <a:xfrm flipH="1">
+                          <a:off x="0" y="0"/>
+                          <a:ext cx="1067647" cy="55034"/>
+                        </a:xfrm>
+                        <a:prstGeom prst="straightConnector1">
+                          <a:avLst/>
+                        </a:prstGeom>
+                        <a:ln>
+                          <a:solidFill>
+                            <a:srgbClr val="EE0000"/>
+                          </a:solidFill>
+                          <a:tailEnd type="triangle"/>
+                        </a:ln>
+                      </wps:spPr>
+                      <wps:style>
+                        <a:lnRef idx="2">
+                          <a:schemeClr val="accent1"/>
+                        </a:lnRef>
+                        <a:fillRef idx="0">
+                          <a:schemeClr val="accent1"/>
+                        </a:fillRef>
+                        <a:effectRef idx="1">
+                          <a:schemeClr val="accent1"/>
+                        </a:effectRef>
+                        <a:fontRef idx="minor">
+                          <a:schemeClr val="tx1"/>
+                        </a:fontRef>
+                      </wps:style>
+                      <wps:bodyPr/>
+                    </wps:wsp>
+                  </a:graphicData>
+                </a:graphic>
+                <wp14:sizeRelH relativeFrom="margin">
+                  <wp14:pctWidth>0</wp14:pctWidth>
+                </wp14:sizeRelH>
+                <wp14:sizeRelV relativeFrom="margin">
+                  <wp14:pctHeight>0</wp14:pctHeight>
+                </wp14:sizeRelV>
+              </wp:anchor>
+            </w:drawing>
+          </mc:Choice>
+          <mc:Fallback>
+            <w:pict>
+              <v:shape w14:anchorId="7F87717C" id="Conector recto de flecha 3" o:spid="_x0000_s1026" type="#_x0000_t32" style="position:absolute;margin-left:308.95pt;margin-top:75.55pt;width:84.05pt;height:4.35pt;flip:x;z-index:251660288;visibility:visible;mso-wrap-style:square;mso-width-percent:0;mso-height-percent:0;mso-wrap-distance-left:9pt;mso-wrap-distance-top:0;mso-wrap-distance-right:9pt;mso-wrap-distance-bottom:0;mso-position-horizontal:absolute;mso-position-horizontal-relative:text;mso-position-vertical:absolute;mso-position-vertical-relative:text;mso-width-percent:0;mso-height-percent:0;mso-width-relative:margin;mso-height-relative:margin" o:gfxdata="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" strokecolor="#e00" strokeweight="1.5pt">
+                <v:stroke endarrow="block" joinstyle="miter"/>
+              </v:shape>
+            </w:pict>
+          </mc:Fallback>
+        </mc:AlternateContent>
+      </w:r>
+      <w:r>
+        <w:rPr>
+          <w:noProof/>
+        </w:rPr>
+        <w:drawing>
+          <wp:inline distT="0" distB="0" distL="0" distR="0" wp14:anchorId="51E2038B" wp14:editId="4A86C454">
+            <wp:extent cx="4371983" cy="3291840"/>
+            <wp:effectExtent l="0" t="0" r="9525" b="3810"/>
+            <wp:docPr id="454653224" name="Imagen 2"/>
+            <wp:cNvGraphicFramePr>
+              <a:graphicFrameLocks xmlns:a="http://schemas.openxmlformats.org/drawingml/2006/main" noChangeAspect="1"/>
+            </wp:cNvGraphicFramePr>
+            <a:graphic xmlns:a="http://schemas.openxmlformats.org/drawingml/2006/main">
+              <a:graphicData uri="http://schemas.openxmlformats.org/drawingml/2006/picture">
+                <pic:pic xmlns:pic="http://schemas.openxmlformats.org/drawingml/2006/picture">
+                  <pic:nvPicPr>
+                    <pic:cNvPr id="454653224" name="Imagen 454653224"/>
+                    <pic:cNvPicPr/>
+                  </pic:nvPicPr>
+                  <pic:blipFill>
+                    <a:blip r:embed="rId25" cstate="print">
+                      <a:extLst>
+                        <a:ext uri="{28A0092B-C50C-407E-A947-70E740481C1C}">
+                          <a14:useLocalDpi xmlns:a14="http://schemas.microsoft.com/office/drawing/2010/main" val="0"/>
+                        </a:ext>
+                      </a:extLst>
+                    </a:blip>
+                    <a:stretch>
+                      <a:fillRect/>
+                    </a:stretch>
+                  </pic:blipFill>
+                  <pic:spPr>
+                    <a:xfrm>
+                      <a:off x="0" y="0"/>
+                      <a:ext cx="4400369" cy="3313213"/>
+                    </a:xfrm>
+                    <a:prstGeom prst="rect">
+                      <a:avLst/>
+                    </a:prstGeom>
+                  </pic:spPr>
+                </pic:pic>
+              </a:graphicData>
+            </a:graphic>
+          </wp:inline>
+        </w:drawing>
+      </w:r>
+    </w:p>
+    <w:p>
+      <w:pPr>
+        <w:pStyle w:val="Descripcin"/>
+        <w:jc w:val="center"/>
+      </w:pPr>
+      <w:r>
+        <w:t xml:space="preserve">Figure </w:t>
+      </w:r>
+      <w:r>
+        <w:fldChar w:fldCharType="begin"/>
+      </w:r>
+      <w:r>
+        <w:instrText xml:space="preserve"> SEQ Figure \* ARABIC </w:instrText>
+      </w:r>
+      <w:r>
+        <w:fldChar w:fldCharType="separate"/>
+      </w:r>
+      <w:r>
+        <w:rPr>
+          <w:noProof/>
+        </w:rPr>
+        <w:t>16</w:t>
+      </w:r>
+      <w:r>
+        <w:fldChar w:fldCharType="end"/>
+      </w:r>
+      <w:r>
+        <w:t xml:space="preserve"> Circuit with </w:t>
+      </w:r>
+      <w:r>
+        <w:t>X</w:t>
+      </w:r>
+      <w:r>
+        <w:t>0 low</w:t>
+      </w:r>
     </w:p>
     <w:p/>
     <w:p>
       <w:pPr>
-        <w:pStyle w:val="Heading2"/>
+        <w:keepNext/>
+        <w:jc w:val="center"/>
+      </w:pPr>
+      <w:r>
+        <w:rPr>
+          <w:noProof/>
+        </w:rPr>
+        <mc:AlternateContent>
+          <mc:Choice Requires="wps">
+            <w:drawing>
+              <wp:anchor distT="0" distB="0" distL="114300" distR="114300" simplePos="0" relativeHeight="251667456" behindDoc="0" locked="0" layoutInCell="1" allowOverlap="1" wp14:anchorId="6F25E6E2" wp14:editId="1ACF1FFD">
+                <wp:simplePos x="0" y="0"/>
+                <wp:positionH relativeFrom="column">
+                  <wp:posOffset>5144819</wp:posOffset>
+                </wp:positionH>
+                <wp:positionV relativeFrom="paragraph">
+                  <wp:posOffset>650484</wp:posOffset>
+                </wp:positionV>
+                <wp:extent cx="1014046" cy="1225062"/>
+                <wp:effectExtent l="0" t="0" r="15240" b="13335"/>
+                <wp:wrapNone/>
+                <wp:docPr id="819463152" name="Cuadro de texto 11"/>
+                <wp:cNvGraphicFramePr/>
+                <a:graphic xmlns:a="http://schemas.openxmlformats.org/drawingml/2006/main">
+                  <a:graphicData uri="http://schemas.microsoft.com/office/word/2010/wordprocessingShape">
+                    <wps:wsp>
+                      <wps:cNvSpPr txBox="1"/>
+                      <wps:spPr>
+                        <a:xfrm>
+                          <a:off x="0" y="0"/>
+                          <a:ext cx="1014046" cy="1225062"/>
+                        </a:xfrm>
+                        <a:prstGeom prst="rect">
+                          <a:avLst/>
+                        </a:prstGeom>
+                        <a:solidFill>
+                          <a:schemeClr val="lt1"/>
+                        </a:solidFill>
+                        <a:ln w="6350">
+                          <a:solidFill>
+                            <a:prstClr val="black"/>
+                          </a:solidFill>
+                        </a:ln>
+                      </wps:spPr>
+                      <wps:txbx>
+                        <w:txbxContent>
+                          <w:p>
+                            <w:pPr>
+                              <w:jc w:val="center"/>
+                            </w:pPr>
+                            <w:r>
+                              <w:t xml:space="preserve">Y0 </w:t>
+                            </w:r>
+                            <w:r>
+                              <w:t xml:space="preserve">and Y1 are </w:t>
+                            </w:r>
+                            <w:r>
+                              <w:t>o</w:t>
+                            </w:r>
+                            <w:r>
+                              <w:t>n, motor and green led respectively</w:t>
+                            </w:r>
+                          </w:p>
+                        </w:txbxContent>
+                      </wps:txbx>
+                      <wps:bodyPr rot="0" spcFirstLastPara="0" vertOverflow="overflow" horzOverflow="overflow" vert="horz" wrap="square" lIns="91440" tIns="45720" rIns="91440" bIns="45720" numCol="1" spcCol="0" rtlCol="0" fromWordArt="0" anchor="t" anchorCtr="0" forceAA="0" compatLnSpc="1">
+                        <a:prstTxWarp prst="textNoShape">
+                          <a:avLst/>
+                        </a:prstTxWarp>
+                        <a:noAutofit/>
+                      </wps:bodyPr>
+                    </wps:wsp>
+                  </a:graphicData>
+                </a:graphic>
+                <wp14:sizeRelV relativeFrom="margin">
+                  <wp14:pctHeight>0</wp14:pctHeight>
+                </wp14:sizeRelV>
+              </wp:anchor>
+            </w:drawing>
+          </mc:Choice>
+          <mc:Fallback>
+            <w:pict>
+              <v:shape w14:anchorId="6F25E6E2" id="Cuadro de texto 11" o:spid="_x0000_s1029" type="#_x0000_t202" style="position:absolute;left:0;text-align:left;margin-left:405.1pt;margin-top:51.2pt;width:79.85pt;height:96.45pt;z-index:251667456;visibility:visible;mso-wrap-style:square;mso-height-percent:0;mso-wrap-distance-left:9pt;mso-wrap-distance-top:0;mso-wrap-distance-right:9pt;mso-wrap-distance-bottom:0;mso-position-horizontal:absolute;mso-position-horizontal-relative:text;mso-position-vertical:absolute;mso-position-vertical-relative:text;mso-height-percent:0;mso-height-relative:margin;v-text-anchor:top" o:gfxdata="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" fillcolor="white [3201]" strokeweight=".5pt">
+                <v:textbox>
+                  <w:txbxContent>
+                    <w:p>
+                      <w:pPr>
+                        <w:jc w:val="center"/>
+                      </w:pPr>
+                      <w:r>
+                        <w:t xml:space="preserve">Y0 </w:t>
+                      </w:r>
+                      <w:r>
+                        <w:t xml:space="preserve">and Y1 are </w:t>
+                      </w:r>
+                      <w:r>
+                        <w:t>o</w:t>
+                      </w:r>
+                      <w:r>
+                        <w:t>n, motor and green led respectively</w:t>
+                      </w:r>
+                    </w:p>
+                  </w:txbxContent>
+                </v:textbox>
+              </v:shape>
+            </w:pict>
+          </mc:Fallback>
+        </mc:AlternateContent>
+      </w:r>
+      <w:r>
+        <w:rPr>
+          <w:noProof/>
+        </w:rPr>
+        <mc:AlternateContent>
+          <mc:Choice Requires="wps">
+            <w:drawing>
+              <wp:anchor distT="0" distB="0" distL="114300" distR="114300" simplePos="0" relativeHeight="251666432" behindDoc="0" locked="0" layoutInCell="1" allowOverlap="1" wp14:anchorId="69808369" wp14:editId="267B7234">
+                <wp:simplePos x="0" y="0"/>
+                <wp:positionH relativeFrom="column">
+                  <wp:posOffset>3749773</wp:posOffset>
+                </wp:positionH>
+                <wp:positionV relativeFrom="paragraph">
+                  <wp:posOffset>984592</wp:posOffset>
+                </wp:positionV>
+                <wp:extent cx="1348154" cy="0"/>
+                <wp:effectExtent l="38100" t="76200" r="0" b="95250"/>
+                <wp:wrapNone/>
+                <wp:docPr id="2073852037" name="Conector recto de flecha 10"/>
+                <wp:cNvGraphicFramePr/>
+                <a:graphic xmlns:a="http://schemas.openxmlformats.org/drawingml/2006/main">
+                  <a:graphicData uri="http://schemas.microsoft.com/office/word/2010/wordprocessingShape">
+                    <wps:wsp>
+                      <wps:cNvCnPr/>
+                      <wps:spPr>
+                        <a:xfrm flipH="1">
+                          <a:off x="0" y="0"/>
+                          <a:ext cx="1348154" cy="0"/>
+                        </a:xfrm>
+                        <a:prstGeom prst="straightConnector1">
+                          <a:avLst/>
+                        </a:prstGeom>
+                        <a:ln>
+                          <a:solidFill>
+                            <a:srgbClr val="EE0000"/>
+                          </a:solidFill>
+                          <a:tailEnd type="triangle"/>
+                        </a:ln>
+                      </wps:spPr>
+                      <wps:style>
+                        <a:lnRef idx="2">
+                          <a:schemeClr val="accent1"/>
+                        </a:lnRef>
+                        <a:fillRef idx="0">
+                          <a:schemeClr val="accent1"/>
+                        </a:fillRef>
+                        <a:effectRef idx="1">
+                          <a:schemeClr val="accent1"/>
+                        </a:effectRef>
+                        <a:fontRef idx="minor">
+                          <a:schemeClr val="tx1"/>
+                        </a:fontRef>
+                      </wps:style>
+                      <wps:bodyPr/>
+                    </wps:wsp>
+                  </a:graphicData>
+                </a:graphic>
+              </wp:anchor>
+            </w:drawing>
+          </mc:Choice>
+          <mc:Fallback>
+            <w:pict>
+              <v:shape w14:anchorId="4D4CBC89" id="Conector recto de flecha 10" o:spid="_x0000_s1026" type="#_x0000_t32" style="position:absolute;margin-left:295.25pt;margin-top:77.55pt;width:106.15pt;height:0;flip:x;z-index:251666432;visibility:visible;mso-wrap-style:square;mso-wrap-distance-left:9pt;mso-wrap-distance-top:0;mso-wrap-distance-right:9pt;mso-wrap-distance-bottom:0;mso-position-horizontal:absolute;mso-position-horizontal-relative:text;mso-position-vertical:absolute;mso-position-vertical-relative:text" o:gfxdata="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" strokecolor="#e00" strokeweight="1.5pt">
+                <v:stroke endarrow="block" joinstyle="miter"/>
+              </v:shape>
+            </w:pict>
+          </mc:Fallback>
+        </mc:AlternateContent>
+      </w:r>
+      <w:r>
+        <w:rPr>
+          <w:noProof/>
+        </w:rPr>
+        <mc:AlternateContent>
+          <mc:Choice Requires="wps">
+            <w:drawing>
+              <wp:anchor distT="0" distB="0" distL="114300" distR="114300" simplePos="0" relativeHeight="251665408" behindDoc="0" locked="0" layoutInCell="1" allowOverlap="1" wp14:anchorId="5C767DC3" wp14:editId="79A7C1AE">
+                <wp:simplePos x="0" y="0"/>
+                <wp:positionH relativeFrom="column">
+                  <wp:posOffset>-781197</wp:posOffset>
+                </wp:positionH>
+                <wp:positionV relativeFrom="paragraph">
+                  <wp:posOffset>2748915</wp:posOffset>
+                </wp:positionV>
+                <wp:extent cx="990600" cy="521677"/>
+                <wp:effectExtent l="0" t="0" r="19050" b="12065"/>
+                <wp:wrapNone/>
+                <wp:docPr id="684249418" name="Cuadro de texto 9"/>
+                <wp:cNvGraphicFramePr/>
+                <a:graphic xmlns:a="http://schemas.openxmlformats.org/drawingml/2006/main">
+                  <a:graphicData uri="http://schemas.microsoft.com/office/word/2010/wordprocessingShape">
+                    <wps:wsp>
+                      <wps:cNvSpPr txBox="1"/>
+                      <wps:spPr>
+                        <a:xfrm>
+                          <a:off x="0" y="0"/>
+                          <a:ext cx="990600" cy="521677"/>
+                        </a:xfrm>
+                        <a:prstGeom prst="rect">
+                          <a:avLst/>
+                        </a:prstGeom>
+                        <a:solidFill>
+                          <a:schemeClr val="lt1"/>
+                        </a:solidFill>
+                        <a:ln w="6350">
+                          <a:solidFill>
+                            <a:prstClr val="black"/>
+                          </a:solidFill>
+                        </a:ln>
+                      </wps:spPr>
+                      <wps:txbx>
+                        <w:txbxContent>
+                          <w:p>
+                            <w:pPr>
+                              <w:jc w:val="center"/>
+                              <w:rPr>
+                                <w:lang w:val="es-ES"/>
+                              </w:rPr>
+                            </w:pPr>
+                            <w:r>
+                              <w:rPr>
+                                <w:lang w:val="es-ES"/>
+                              </w:rPr>
+                              <w:t xml:space="preserve">X0 switch </w:t>
+                            </w:r>
+                            <w:proofErr w:type="spellStart"/>
+                            <w:r>
+                              <w:rPr>
+                                <w:lang w:val="es-ES"/>
+                              </w:rPr>
+                              <w:t>is</w:t>
+                            </w:r>
+                            <w:proofErr w:type="spellEnd"/>
+                            <w:r>
+                              <w:rPr>
+                                <w:lang w:val="es-ES"/>
+                              </w:rPr>
+                              <w:t xml:space="preserve"> high</w:t>
+                            </w:r>
+                          </w:p>
+                        </w:txbxContent>
+                      </wps:txbx>
+                      <wps:bodyPr rot="0" spcFirstLastPara="0" vertOverflow="overflow" horzOverflow="overflow" vert="horz" wrap="square" lIns="91440" tIns="45720" rIns="91440" bIns="45720" numCol="1" spcCol="0" rtlCol="0" fromWordArt="0" anchor="t" anchorCtr="0" forceAA="0" compatLnSpc="1">
+                        <a:prstTxWarp prst="textNoShape">
+                          <a:avLst/>
+                        </a:prstTxWarp>
+                        <a:noAutofit/>
+                      </wps:bodyPr>
+                    </wps:wsp>
+                  </a:graphicData>
+                </a:graphic>
+                <wp14:sizeRelV relativeFrom="margin">
+                  <wp14:pctHeight>0</wp14:pctHeight>
+                </wp14:sizeRelV>
+              </wp:anchor>
+            </w:drawing>
+          </mc:Choice>
+          <mc:Fallback>
+            <w:pict>
+              <v:shape w14:anchorId="5C767DC3" id="Cuadro de texto 9" o:spid="_x0000_s1030" type="#_x0000_t202" style="position:absolute;left:0;text-align:left;margin-left:-61.5pt;margin-top:216.45pt;width:78pt;height:41.1pt;z-index:251665408;visibility:visible;mso-wrap-style:square;mso-height-percent:0;mso-wrap-distance-left:9pt;mso-wrap-distance-top:0;mso-wrap-distance-right:9pt;mso-wrap-distance-bottom:0;mso-position-horizontal:absolute;mso-position-horizontal-relative:text;mso-position-vertical:absolute;mso-position-vertical-relative:text;mso-height-percent:0;mso-height-relative:margin;v-text-anchor:top" o:gfxdata="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" fillcolor="white [3201]" strokeweight=".5pt">
+                <v:textbox>
+                  <w:txbxContent>
+                    <w:p>
+                      <w:pPr>
+                        <w:jc w:val="center"/>
+                        <w:rPr>
+                          <w:lang w:val="es-ES"/>
+                        </w:rPr>
+                      </w:pPr>
+                      <w:r>
+                        <w:rPr>
+                          <w:lang w:val="es-ES"/>
+                        </w:rPr>
+                        <w:t xml:space="preserve">X0 switch </w:t>
+                      </w:r>
+                      <w:proofErr w:type="spellStart"/>
+                      <w:r>
+                        <w:rPr>
+                          <w:lang w:val="es-ES"/>
+                        </w:rPr>
+                        <w:t>is</w:t>
+                      </w:r>
+                      <w:proofErr w:type="spellEnd"/>
+                      <w:r>
+                        <w:rPr>
+                          <w:lang w:val="es-ES"/>
+                        </w:rPr>
+                        <w:t xml:space="preserve"> high</w:t>
+                      </w:r>
+                    </w:p>
+                  </w:txbxContent>
+                </v:textbox>
+              </v:shape>
+            </w:pict>
+          </mc:Fallback>
+        </mc:AlternateContent>
+      </w:r>
+      <w:r>
+        <w:rPr>
+          <w:noProof/>
+        </w:rPr>
+        <mc:AlternateContent>
+          <mc:Choice Requires="wps">
+            <w:drawing>
+              <wp:anchor distT="0" distB="0" distL="114300" distR="114300" simplePos="0" relativeHeight="251664384" behindDoc="0" locked="0" layoutInCell="1" allowOverlap="1" wp14:anchorId="28809682" wp14:editId="324DCF12">
+                <wp:simplePos x="0" y="0"/>
+                <wp:positionH relativeFrom="column">
+                  <wp:posOffset>250433</wp:posOffset>
+                </wp:positionH>
+                <wp:positionV relativeFrom="paragraph">
+                  <wp:posOffset>3041992</wp:posOffset>
+                </wp:positionV>
+                <wp:extent cx="978877" cy="23446"/>
+                <wp:effectExtent l="0" t="57150" r="50165" b="91440"/>
+                <wp:wrapNone/>
+                <wp:docPr id="2003610572" name="Conector recto de flecha 8"/>
+                <wp:cNvGraphicFramePr/>
+                <a:graphic xmlns:a="http://schemas.openxmlformats.org/drawingml/2006/main">
+                  <a:graphicData uri="http://schemas.microsoft.com/office/word/2010/wordprocessingShape">
+                    <wps:wsp>
+                      <wps:cNvCnPr/>
+                      <wps:spPr>
+                        <a:xfrm>
+                          <a:off x="0" y="0"/>
+                          <a:ext cx="978877" cy="23446"/>
+                        </a:xfrm>
+                        <a:prstGeom prst="straightConnector1">
+                          <a:avLst/>
+                        </a:prstGeom>
+                        <a:ln>
+                          <a:solidFill>
+                            <a:srgbClr val="EE0000"/>
+                          </a:solidFill>
+                          <a:tailEnd type="triangle"/>
+                        </a:ln>
+                      </wps:spPr>
+                      <wps:style>
+                        <a:lnRef idx="2">
+                          <a:schemeClr val="accent1"/>
+                        </a:lnRef>
+                        <a:fillRef idx="0">
+                          <a:schemeClr val="accent1"/>
+                        </a:fillRef>
+                        <a:effectRef idx="1">
+                          <a:schemeClr val="accent1"/>
+                        </a:effectRef>
+                        <a:fontRef idx="minor">
+                          <a:schemeClr val="tx1"/>
+                        </a:fontRef>
+                      </wps:style>
+                      <wps:bodyPr/>
+                    </wps:wsp>
+                  </a:graphicData>
+                </a:graphic>
+              </wp:anchor>
+            </w:drawing>
+          </mc:Choice>
+          <mc:Fallback>
+            <w:pict>
+              <v:shape w14:anchorId="19810498" id="Conector recto de flecha 8" o:spid="_x0000_s1026" type="#_x0000_t32" style="position:absolute;margin-left:19.7pt;margin-top:239.55pt;width:77.1pt;height:1.85pt;z-index:251664384;visibility:visible;mso-wrap-style:square;mso-wrap-distance-left:9pt;mso-wrap-distance-top:0;mso-wrap-distance-right:9pt;mso-wrap-distance-bottom:0;mso-position-horizontal:absolute;mso-position-horizontal-relative:text;mso-position-vertical:absolute;mso-position-vertical-relative:text" o:gfxdata="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" strokecolor="#e00" strokeweight="1.5pt">
+                <v:stroke endarrow="block" joinstyle="miter"/>
+              </v:shape>
+            </w:pict>
+          </mc:Fallback>
+        </mc:AlternateContent>
+      </w:r>
+      <w:r>
+        <w:rPr>
+          <w:noProof/>
+        </w:rPr>
+        <w:drawing>
+          <wp:inline distT="0" distB="0" distL="0" distR="0" wp14:anchorId="549A17AE" wp14:editId="3653669D">
+            <wp:extent cx="4387164" cy="3303270"/>
+            <wp:effectExtent l="0" t="0" r="0" b="0"/>
+            <wp:docPr id="1190328395" name="Imagen 7"/>
+            <wp:cNvGraphicFramePr>
+              <a:graphicFrameLocks xmlns:a="http://schemas.openxmlformats.org/drawingml/2006/main" noChangeAspect="1"/>
+            </wp:cNvGraphicFramePr>
+            <a:graphic xmlns:a="http://schemas.openxmlformats.org/drawingml/2006/main">
+              <a:graphicData uri="http://schemas.openxmlformats.org/drawingml/2006/picture">
+                <pic:pic xmlns:pic="http://schemas.openxmlformats.org/drawingml/2006/picture">
+                  <pic:nvPicPr>
+                    <pic:cNvPr id="1190328395" name="Imagen 1190328395"/>
+                    <pic:cNvPicPr/>
+                  </pic:nvPicPr>
+                  <pic:blipFill>
+                    <a:blip r:embed="rId26" cstate="print">
+                      <a:extLst>
+                        <a:ext uri="{28A0092B-C50C-407E-A947-70E740481C1C}">
+                          <a14:useLocalDpi xmlns:a14="http://schemas.microsoft.com/office/drawing/2010/main" val="0"/>
+                        </a:ext>
+                      </a:extLst>
+                    </a:blip>
+                    <a:stretch>
+                      <a:fillRect/>
+                    </a:stretch>
+                  </pic:blipFill>
+                  <pic:spPr>
+                    <a:xfrm>
+                      <a:off x="0" y="0"/>
+                      <a:ext cx="4406870" cy="3318107"/>
+                    </a:xfrm>
+                    <a:prstGeom prst="rect">
+                      <a:avLst/>
+                    </a:prstGeom>
+                  </pic:spPr>
+                </pic:pic>
+              </a:graphicData>
+            </a:graphic>
+          </wp:inline>
+        </w:drawing>
+      </w:r>
+    </w:p>
+    <w:p>
+      <w:pPr>
+        <w:pStyle w:val="Descripcin"/>
+        <w:jc w:val="center"/>
+      </w:pPr>
+      <w:r>
+        <w:t xml:space="preserve">Figure </w:t>
+      </w:r>
+      <w:r>
+        <w:fldChar w:fldCharType="begin"/>
+      </w:r>
+      <w:r>
+        <w:instrText xml:space="preserve"> SEQ Figure \* ARABIC </w:instrText>
+      </w:r>
+      <w:r>
+        <w:fldChar w:fldCharType="separate"/>
+      </w:r>
+      <w:r>
+        <w:rPr>
+          <w:noProof/>
+        </w:rPr>
+        <w:t>17</w:t>
+      </w:r>
+      <w:r>
+        <w:fldChar w:fldCharType="end"/>
+      </w:r>
+      <w:r>
+        <w:t xml:space="preserve"> Circuit with X0 high</w:t>
+      </w:r>
+    </w:p>
+    <w:p>
+      <w:pPr>
+        <w:jc w:val="center"/>
+      </w:pPr>
+    </w:p>
+    <w:p>
+      <w:pPr>
+        <w:pStyle w:val="Ttulo2"/>
         <w:numPr>
           <w:ilvl w:val="0"/>
           <w:numId w:val="7"/>
         </w:numPr>
       </w:pPr>
-      <w:bookmarkStart w:id="17" w:name="_Toc241949115"/>
+      <w:bookmarkStart w:id="17" w:name="_Toc242299910"/>
       <w:r>
         <w:lastRenderedPageBreak/>
         <w:t>Three-phase (415V) supply</w:t>
@@ -3715,7 +4654,7 @@
                     <pic:cNvPicPr/>
                   </pic:nvPicPr>
                   <pic:blipFill>
-                    <a:blip r:embed="rId24" cstate="print">
+                    <a:blip r:embed="rId27" cstate="print">
                       <a:extLst>
                         <a:ext uri="{28A0092B-C50C-407E-A947-70E740481C1C}">
                           <a14:useLocalDpi xmlns:a14="http://schemas.microsoft.com/office/drawing/2010/main" val="0"/>
@@ -3744,7 +4683,7 @@
     </w:p>
     <w:p>
       <w:pPr>
-        <w:pStyle w:val="Caption"/>
+        <w:pStyle w:val="Descripcin"/>
         <w:jc w:val="center"/>
       </w:pPr>
       <w:r>
@@ -3763,7 +4702,7 @@
         <w:rPr>
           <w:noProof/>
         </w:rPr>
-        <w:t>15</w:t>
+        <w:t>18</w:t>
       </w:r>
       <w:r>
         <w:fldChar w:fldCharType="end"/>
@@ -3780,19 +4719,31 @@
     </w:p>
     <w:p>
       <w:pPr>
-        <w:pStyle w:val="Heading2"/>
+        <w:pStyle w:val="Ttulo2"/>
         <w:numPr>
           <w:ilvl w:val="0"/>
           <w:numId w:val="7"/>
         </w:numPr>
       </w:pPr>
-      <w:bookmarkStart w:id="18" w:name="_Toc241949116"/>
+      <w:bookmarkStart w:id="18" w:name="_Toc242299911"/>
       <w:r>
         <w:t>Conclusion and Discussion of results</w:t>
       </w:r>
       <w:bookmarkEnd w:id="18"/>
-      <w:r>
-        <w:tab/>
+    </w:p>
+    <w:p>
+      <w:r>
+        <w:t xml:space="preserve">During this lab practical, an introduction was provided to the Mitsubishi FX3G PLC training kit, the various types of contacts, the use of basic logic operations, Ladder diagram programming, and the GX Works2 software. </w:t>
+      </w:r>
+    </w:p>
+    <w:p>
+      <w:r>
+        <w:t xml:space="preserve">It also covered the correct execution of programs and debugging tests within GX Works2 for the different Ladder programming exercises. This approach made it possible to demonstrate that these exercises corresponded to the AND, OR, NOR, NAND, NOT, and XOR logic operations. </w:t>
+      </w:r>
+    </w:p>
+    <w:p>
+      <w:r>
+        <w:t>Finally, the last part of the assignment helped to bridge this theoretical knowledge with a preliminary industrial application through the implementation of a motor and control LEDs.</w:t>
       </w:r>
     </w:p>
     <w:sectPr>
@@ -3816,7 +4767,7 @@
     <w:lvl w:ilvl="0">
       <w:start w:val="1"/>
       <w:numFmt w:val="decimal"/>
-      <w:pStyle w:val="ListNumber"/>
+      <w:pStyle w:val="Listaconnmeros"/>
       <w:lvlText w:val="%1."/>
       <w:lvlJc w:val="left"/>
       <w:pPr>
@@ -4789,11 +5740,11 @@
       <w:lang w:val="en-GB"/>
     </w:rPr>
   </w:style>
-  <w:style w:type="paragraph" w:styleId="Heading1">
+  <w:style w:type="paragraph" w:styleId="Ttulo1">
     <w:name w:val="heading 1"/>
     <w:basedOn w:val="Normal"/>
     <w:next w:val="Normal"/>
-    <w:link w:val="Heading1Char"/>
+    <w:link w:val="Ttulo1Car"/>
     <w:autoRedefine/>
     <w:uiPriority w:val="9"/>
     <w:qFormat/>
@@ -4816,11 +5767,11 @@
       <w:szCs w:val="29"/>
     </w:rPr>
   </w:style>
-  <w:style w:type="paragraph" w:styleId="Heading2">
+  <w:style w:type="paragraph" w:styleId="Ttulo2">
     <w:name w:val="heading 2"/>
     <w:basedOn w:val="Normal"/>
     <w:next w:val="Normal"/>
-    <w:link w:val="Heading2Char"/>
+    <w:link w:val="Ttulo2Car"/>
     <w:autoRedefine/>
     <w:uiPriority w:val="9"/>
     <w:unhideWhenUsed/>
@@ -4842,11 +5793,11 @@
       <w:szCs w:val="23"/>
     </w:rPr>
   </w:style>
-  <w:style w:type="paragraph" w:styleId="Heading3">
+  <w:style w:type="paragraph" w:styleId="Ttulo3">
     <w:name w:val="heading 3"/>
     <w:basedOn w:val="Normal"/>
     <w:next w:val="Normal"/>
-    <w:link w:val="Heading3Char"/>
+    <w:link w:val="Ttulo3Car"/>
     <w:uiPriority w:val="9"/>
     <w:unhideWhenUsed/>
     <w:qFormat/>
@@ -4864,11 +5815,11 @@
       <w:szCs w:val="28"/>
     </w:rPr>
   </w:style>
-  <w:style w:type="paragraph" w:styleId="Heading4">
+  <w:style w:type="paragraph" w:styleId="Ttulo4">
     <w:name w:val="heading 4"/>
     <w:basedOn w:val="Normal"/>
     <w:next w:val="Normal"/>
-    <w:link w:val="Heading4Char"/>
+    <w:link w:val="Ttulo4Car"/>
     <w:uiPriority w:val="9"/>
     <w:semiHidden/>
     <w:unhideWhenUsed/>
@@ -4887,11 +5838,11 @@
       <w:color w:val="0F4761" w:themeColor="accent1" w:themeShade="BF"/>
     </w:rPr>
   </w:style>
-  <w:style w:type="paragraph" w:styleId="Heading5">
+  <w:style w:type="paragraph" w:styleId="Ttulo5">
     <w:name w:val="heading 5"/>
     <w:basedOn w:val="Normal"/>
     <w:next w:val="Normal"/>
-    <w:link w:val="Heading5Char"/>
+    <w:link w:val="Ttulo5Car"/>
     <w:uiPriority w:val="9"/>
     <w:semiHidden/>
     <w:unhideWhenUsed/>
@@ -4908,11 +5859,11 @@
       <w:color w:val="0F4761" w:themeColor="accent1" w:themeShade="BF"/>
     </w:rPr>
   </w:style>
-  <w:style w:type="paragraph" w:styleId="Heading6">
+  <w:style w:type="paragraph" w:styleId="Ttulo6">
     <w:name w:val="heading 6"/>
     <w:basedOn w:val="Normal"/>
     <w:next w:val="Normal"/>
-    <w:link w:val="Heading6Char"/>
+    <w:link w:val="Ttulo6Car"/>
     <w:uiPriority w:val="9"/>
     <w:semiHidden/>
     <w:unhideWhenUsed/>
@@ -4931,11 +5882,11 @@
       <w:color w:val="595959" w:themeColor="text1" w:themeTint="A6"/>
     </w:rPr>
   </w:style>
-  <w:style w:type="paragraph" w:styleId="Heading7">
+  <w:style w:type="paragraph" w:styleId="Ttulo7">
     <w:name w:val="heading 7"/>
     <w:basedOn w:val="Normal"/>
     <w:next w:val="Normal"/>
-    <w:link w:val="Heading7Char"/>
+    <w:link w:val="Ttulo7Car"/>
     <w:uiPriority w:val="9"/>
     <w:semiHidden/>
     <w:unhideWhenUsed/>
@@ -4952,11 +5903,11 @@
       <w:color w:val="595959" w:themeColor="text1" w:themeTint="A6"/>
     </w:rPr>
   </w:style>
-  <w:style w:type="paragraph" w:styleId="Heading8">
+  <w:style w:type="paragraph" w:styleId="Ttulo8">
     <w:name w:val="heading 8"/>
     <w:basedOn w:val="Normal"/>
     <w:next w:val="Normal"/>
-    <w:link w:val="Heading8Char"/>
+    <w:link w:val="Ttulo8Car"/>
     <w:uiPriority w:val="9"/>
     <w:semiHidden/>
     <w:unhideWhenUsed/>
@@ -4975,11 +5926,11 @@
       <w:color w:val="272727" w:themeColor="text1" w:themeTint="D8"/>
     </w:rPr>
   </w:style>
-  <w:style w:type="paragraph" w:styleId="Heading9">
+  <w:style w:type="paragraph" w:styleId="Ttulo9">
     <w:name w:val="heading 9"/>
     <w:basedOn w:val="Normal"/>
     <w:next w:val="Normal"/>
-    <w:link w:val="Heading9Char"/>
+    <w:link w:val="Ttulo9Car"/>
     <w:uiPriority w:val="9"/>
     <w:semiHidden/>
     <w:unhideWhenUsed/>
@@ -4996,13 +5947,13 @@
       <w:color w:val="272727" w:themeColor="text1" w:themeTint="D8"/>
     </w:rPr>
   </w:style>
-  <w:style w:type="character" w:default="1" w:styleId="DefaultParagraphFont">
+  <w:style w:type="character" w:default="1" w:styleId="Fuentedeprrafopredeter">
     <w:name w:val="Default Paragraph Font"/>
     <w:uiPriority w:val="1"/>
     <w:semiHidden/>
     <w:unhideWhenUsed/>
   </w:style>
-  <w:style w:type="table" w:default="1" w:styleId="TableNormal">
+  <w:style w:type="table" w:default="1" w:styleId="Tablanormal">
     <w:name w:val="Normal Table"/>
     <w:uiPriority w:val="99"/>
     <w:semiHidden/>
@@ -5017,16 +5968,16 @@
       </w:tblCellMar>
     </w:tblPr>
   </w:style>
-  <w:style w:type="numbering" w:default="1" w:styleId="NoList">
+  <w:style w:type="numbering" w:default="1" w:styleId="Sinlista">
     <w:name w:val="No List"/>
     <w:uiPriority w:val="99"/>
     <w:semiHidden/>
     <w:unhideWhenUsed/>
   </w:style>
-  <w:style w:type="character" w:customStyle="1" w:styleId="Heading1Char">
-    <w:name w:val="Heading 1 Char"/>
-    <w:basedOn w:val="DefaultParagraphFont"/>
-    <w:link w:val="Heading1"/>
+  <w:style w:type="character" w:customStyle="1" w:styleId="Ttulo1Car">
+    <w:name w:val="Título 1 Car"/>
+    <w:basedOn w:val="Fuentedeprrafopredeter"/>
+    <w:link w:val="Ttulo1"/>
     <w:uiPriority w:val="9"/>
     <w:rsid w:val="00CF289F"/>
     <w:rPr>
@@ -5037,10 +5988,10 @@
       <w:szCs w:val="29"/>
     </w:rPr>
   </w:style>
-  <w:style w:type="character" w:customStyle="1" w:styleId="Heading2Char">
-    <w:name w:val="Heading 2 Char"/>
-    <w:basedOn w:val="DefaultParagraphFont"/>
-    <w:link w:val="Heading2"/>
+  <w:style w:type="character" w:customStyle="1" w:styleId="Ttulo2Car">
+    <w:name w:val="Título 2 Car"/>
+    <w:basedOn w:val="Fuentedeprrafopredeter"/>
+    <w:link w:val="Ttulo2"/>
     <w:uiPriority w:val="9"/>
     <w:rsid w:val="0094206E"/>
     <w:rPr>
@@ -5050,10 +6001,10 @@
       <w:szCs w:val="23"/>
     </w:rPr>
   </w:style>
-  <w:style w:type="character" w:customStyle="1" w:styleId="Heading3Char">
-    <w:name w:val="Heading 3 Char"/>
-    <w:basedOn w:val="DefaultParagraphFont"/>
-    <w:link w:val="Heading3"/>
+  <w:style w:type="character" w:customStyle="1" w:styleId="Ttulo3Car">
+    <w:name w:val="Título 3 Car"/>
+    <w:basedOn w:val="Fuentedeprrafopredeter"/>
+    <w:link w:val="Ttulo3"/>
     <w:uiPriority w:val="9"/>
     <w:rsid w:val="000C0CF6"/>
     <w:rPr>
@@ -5063,10 +6014,10 @@
       <w:szCs w:val="28"/>
     </w:rPr>
   </w:style>
-  <w:style w:type="character" w:customStyle="1" w:styleId="Heading4Char">
-    <w:name w:val="Heading 4 Char"/>
-    <w:basedOn w:val="DefaultParagraphFont"/>
-    <w:link w:val="Heading4"/>
+  <w:style w:type="character" w:customStyle="1" w:styleId="Ttulo4Car">
+    <w:name w:val="Título 4 Car"/>
+    <w:basedOn w:val="Fuentedeprrafopredeter"/>
+    <w:link w:val="Ttulo4"/>
     <w:uiPriority w:val="9"/>
     <w:semiHidden/>
     <w:rsid w:val="000C0CF6"/>
@@ -5077,10 +6028,10 @@
       <w:color w:val="0F4761" w:themeColor="accent1" w:themeShade="BF"/>
     </w:rPr>
   </w:style>
-  <w:style w:type="character" w:customStyle="1" w:styleId="Heading5Char">
-    <w:name w:val="Heading 5 Char"/>
-    <w:basedOn w:val="DefaultParagraphFont"/>
-    <w:link w:val="Heading5"/>
+  <w:style w:type="character" w:customStyle="1" w:styleId="Ttulo5Car">
+    <w:name w:val="Título 5 Car"/>
+    <w:basedOn w:val="Fuentedeprrafopredeter"/>
+    <w:link w:val="Ttulo5"/>
     <w:uiPriority w:val="9"/>
     <w:semiHidden/>
     <w:rsid w:val="000C0CF6"/>
@@ -5089,10 +6040,10 @@
       <w:color w:val="0F4761" w:themeColor="accent1" w:themeShade="BF"/>
     </w:rPr>
   </w:style>
-  <w:style w:type="character" w:customStyle="1" w:styleId="Heading6Char">
-    <w:name w:val="Heading 6 Char"/>
-    <w:basedOn w:val="DefaultParagraphFont"/>
-    <w:link w:val="Heading6"/>
+  <w:style w:type="character" w:customStyle="1" w:styleId="Ttulo6Car">
+    <w:name w:val="Título 6 Car"/>
+    <w:basedOn w:val="Fuentedeprrafopredeter"/>
+    <w:link w:val="Ttulo6"/>
     <w:uiPriority w:val="9"/>
     <w:semiHidden/>
     <w:rsid w:val="000C0CF6"/>
@@ -5103,10 +6054,10 @@
       <w:color w:val="595959" w:themeColor="text1" w:themeTint="A6"/>
     </w:rPr>
   </w:style>
-  <w:style w:type="character" w:customStyle="1" w:styleId="Heading7Char">
-    <w:name w:val="Heading 7 Char"/>
-    <w:basedOn w:val="DefaultParagraphFont"/>
-    <w:link w:val="Heading7"/>
+  <w:style w:type="character" w:customStyle="1" w:styleId="Ttulo7Car">
+    <w:name w:val="Título 7 Car"/>
+    <w:basedOn w:val="Fuentedeprrafopredeter"/>
+    <w:link w:val="Ttulo7"/>
     <w:uiPriority w:val="9"/>
     <w:semiHidden/>
     <w:rsid w:val="000C0CF6"/>
@@ -5115,10 +6066,10 @@
       <w:color w:val="595959" w:themeColor="text1" w:themeTint="A6"/>
     </w:rPr>
   </w:style>
-  <w:style w:type="character" w:customStyle="1" w:styleId="Heading8Char">
-    <w:name w:val="Heading 8 Char"/>
-    <w:basedOn w:val="DefaultParagraphFont"/>
-    <w:link w:val="Heading8"/>
+  <w:style w:type="character" w:customStyle="1" w:styleId="Ttulo8Car">
+    <w:name w:val="Título 8 Car"/>
+    <w:basedOn w:val="Fuentedeprrafopredeter"/>
+    <w:link w:val="Ttulo8"/>
     <w:uiPriority w:val="9"/>
     <w:semiHidden/>
     <w:rsid w:val="000C0CF6"/>
@@ -5129,10 +6080,10 @@
       <w:color w:val="272727" w:themeColor="text1" w:themeTint="D8"/>
     </w:rPr>
   </w:style>
-  <w:style w:type="character" w:customStyle="1" w:styleId="Heading9Char">
-    <w:name w:val="Heading 9 Char"/>
-    <w:basedOn w:val="DefaultParagraphFont"/>
-    <w:link w:val="Heading9"/>
+  <w:style w:type="character" w:customStyle="1" w:styleId="Ttulo9Car">
+    <w:name w:val="Título 9 Car"/>
+    <w:basedOn w:val="Fuentedeprrafopredeter"/>
+    <w:link w:val="Ttulo9"/>
     <w:uiPriority w:val="9"/>
     <w:semiHidden/>
     <w:rsid w:val="000C0CF6"/>
@@ -5141,11 +6092,11 @@
       <w:color w:val="272727" w:themeColor="text1" w:themeTint="D8"/>
     </w:rPr>
   </w:style>
-  <w:style w:type="paragraph" w:styleId="Title">
+  <w:style w:type="paragraph" w:styleId="Ttulo">
     <w:name w:val="Title"/>
     <w:basedOn w:val="Normal"/>
     <w:next w:val="Normal"/>
-    <w:link w:val="TitleChar"/>
+    <w:link w:val="TtuloCar"/>
     <w:uiPriority w:val="10"/>
     <w:qFormat/>
     <w:rsid w:val="000C0CF6"/>
@@ -5161,10 +6112,10 @@
       <w:szCs w:val="56"/>
     </w:rPr>
   </w:style>
-  <w:style w:type="character" w:customStyle="1" w:styleId="TitleChar">
-    <w:name w:val="Title Char"/>
-    <w:basedOn w:val="DefaultParagraphFont"/>
-    <w:link w:val="Title"/>
+  <w:style w:type="character" w:customStyle="1" w:styleId="TtuloCar">
+    <w:name w:val="Título Car"/>
+    <w:basedOn w:val="Fuentedeprrafopredeter"/>
+    <w:link w:val="Ttulo"/>
     <w:uiPriority w:val="10"/>
     <w:rsid w:val="000C0CF6"/>
     <w:rPr>
@@ -5175,11 +6126,11 @@
       <w:szCs w:val="56"/>
     </w:rPr>
   </w:style>
-  <w:style w:type="paragraph" w:styleId="Subtitle">
+  <w:style w:type="paragraph" w:styleId="Subttulo">
     <w:name w:val="Subtitle"/>
     <w:basedOn w:val="Normal"/>
     <w:next w:val="Normal"/>
-    <w:link w:val="SubtitleChar"/>
+    <w:link w:val="SubttuloCar"/>
     <w:uiPriority w:val="11"/>
     <w:qFormat/>
     <w:rsid w:val="000C0CF6"/>
@@ -5196,10 +6147,10 @@
       <w:szCs w:val="28"/>
     </w:rPr>
   </w:style>
-  <w:style w:type="character" w:customStyle="1" w:styleId="SubtitleChar">
-    <w:name w:val="Subtitle Char"/>
-    <w:basedOn w:val="DefaultParagraphFont"/>
-    <w:link w:val="Subtitle"/>
+  <w:style w:type="character" w:customStyle="1" w:styleId="SubttuloCar">
+    <w:name w:val="Subtítulo Car"/>
+    <w:basedOn w:val="Fuentedeprrafopredeter"/>
+    <w:link w:val="Subttulo"/>
     <w:uiPriority w:val="11"/>
     <w:rsid w:val="000C0CF6"/>
     <w:rPr>
@@ -5210,11 +6161,11 @@
       <w:szCs w:val="28"/>
     </w:rPr>
   </w:style>
-  <w:style w:type="paragraph" w:styleId="Quote">
+  <w:style w:type="paragraph" w:styleId="Cita">
     <w:name w:val="Quote"/>
     <w:basedOn w:val="Normal"/>
     <w:next w:val="Normal"/>
-    <w:link w:val="QuoteChar"/>
+    <w:link w:val="CitaCar"/>
     <w:uiPriority w:val="29"/>
     <w:qFormat/>
     <w:rsid w:val="000C0CF6"/>
@@ -5228,10 +6179,10 @@
       <w:color w:val="404040" w:themeColor="text1" w:themeTint="BF"/>
     </w:rPr>
   </w:style>
-  <w:style w:type="character" w:customStyle="1" w:styleId="QuoteChar">
-    <w:name w:val="Quote Char"/>
-    <w:basedOn w:val="DefaultParagraphFont"/>
-    <w:link w:val="Quote"/>
+  <w:style w:type="character" w:customStyle="1" w:styleId="CitaCar">
+    <w:name w:val="Cita Car"/>
+    <w:basedOn w:val="Fuentedeprrafopredeter"/>
+    <w:link w:val="Cita"/>
     <w:uiPriority w:val="29"/>
     <w:rsid w:val="000C0CF6"/>
     <w:rPr>
@@ -5240,7 +6191,7 @@
       <w:color w:val="404040" w:themeColor="text1" w:themeTint="BF"/>
     </w:rPr>
   </w:style>
-  <w:style w:type="paragraph" w:styleId="ListParagraph">
+  <w:style w:type="paragraph" w:styleId="Prrafodelista">
     <w:name w:val="List Paragraph"/>
     <w:basedOn w:val="Normal"/>
     <w:uiPriority w:val="34"/>
@@ -5251,9 +6202,9 @@
       <w:contextualSpacing/>
     </w:pPr>
   </w:style>
-  <w:style w:type="character" w:styleId="IntenseEmphasis">
+  <w:style w:type="character" w:styleId="nfasisintenso">
     <w:name w:val="Intense Emphasis"/>
-    <w:basedOn w:val="DefaultParagraphFont"/>
+    <w:basedOn w:val="Fuentedeprrafopredeter"/>
     <w:uiPriority w:val="21"/>
     <w:qFormat/>
     <w:rsid w:val="000C0CF6"/>
@@ -5263,11 +6214,11 @@
       <w:color w:val="0F4761" w:themeColor="accent1" w:themeShade="BF"/>
     </w:rPr>
   </w:style>
-  <w:style w:type="paragraph" w:styleId="IntenseQuote">
+  <w:style w:type="paragraph" w:styleId="Citadestacada">
     <w:name w:val="Intense Quote"/>
     <w:basedOn w:val="Normal"/>
     <w:next w:val="Normal"/>
-    <w:link w:val="IntenseQuoteChar"/>
+    <w:link w:val="CitadestacadaCar"/>
     <w:uiPriority w:val="30"/>
     <w:qFormat/>
     <w:rsid w:val="000C0CF6"/>
@@ -5286,10 +6237,10 @@
       <w:color w:val="0F4761" w:themeColor="accent1" w:themeShade="BF"/>
     </w:rPr>
   </w:style>
-  <w:style w:type="character" w:customStyle="1" w:styleId="IntenseQuoteChar">
-    <w:name w:val="Intense Quote Char"/>
-    <w:basedOn w:val="DefaultParagraphFont"/>
-    <w:link w:val="IntenseQuote"/>
+  <w:style w:type="character" w:customStyle="1" w:styleId="CitadestacadaCar">
+    <w:name w:val="Cita destacada Car"/>
+    <w:basedOn w:val="Fuentedeprrafopredeter"/>
+    <w:link w:val="Citadestacada"/>
     <w:uiPriority w:val="30"/>
     <w:rsid w:val="000C0CF6"/>
     <w:rPr>
@@ -5298,9 +6249,9 @@
       <w:color w:val="0F4761" w:themeColor="accent1" w:themeShade="BF"/>
     </w:rPr>
   </w:style>
-  <w:style w:type="character" w:styleId="IntenseReference">
+  <w:style w:type="character" w:styleId="Referenciaintensa">
     <w:name w:val="Intense Reference"/>
-    <w:basedOn w:val="DefaultParagraphFont"/>
+    <w:basedOn w:val="Fuentedeprrafopredeter"/>
     <w:uiPriority w:val="32"/>
     <w:qFormat/>
     <w:rsid w:val="000C0CF6"/>
@@ -5312,9 +6263,9 @@
       <w:spacing w:val="5"/>
     </w:rPr>
   </w:style>
-  <w:style w:type="paragraph" w:styleId="NoSpacing">
+  <w:style w:type="paragraph" w:styleId="Sinespaciado">
     <w:name w:val="No Spacing"/>
-    <w:link w:val="NoSpacingChar"/>
+    <w:link w:val="SinespaciadoCar"/>
     <w:uiPriority w:val="1"/>
     <w:qFormat/>
     <w:rsid w:val="000C0CF6"/>
@@ -5330,10 +6281,10 @@
       <w14:ligatures w14:val="none"/>
     </w:rPr>
   </w:style>
-  <w:style w:type="character" w:customStyle="1" w:styleId="NoSpacingChar">
-    <w:name w:val="No Spacing Char"/>
-    <w:basedOn w:val="DefaultParagraphFont"/>
-    <w:link w:val="NoSpacing"/>
+  <w:style w:type="character" w:customStyle="1" w:styleId="SinespaciadoCar">
+    <w:name w:val="Sin espaciado Car"/>
+    <w:basedOn w:val="Fuentedeprrafopredeter"/>
+    <w:link w:val="Sinespaciado"/>
     <w:uiPriority w:val="1"/>
     <w:rsid w:val="000C0CF6"/>
     <w:rPr>
@@ -5345,9 +6296,9 @@
       <w14:ligatures w14:val="none"/>
     </w:rPr>
   </w:style>
-  <w:style w:type="paragraph" w:styleId="TOCHeading">
+  <w:style w:type="paragraph" w:styleId="TtuloTDC">
     <w:name w:val="TOC Heading"/>
-    <w:basedOn w:val="Heading1"/>
+    <w:basedOn w:val="Ttulo1"/>
     <w:next w:val="Normal"/>
     <w:uiPriority w:val="39"/>
     <w:unhideWhenUsed/>
@@ -5370,7 +6321,7 @@
       <w14:ligatures w14:val="none"/>
     </w:rPr>
   </w:style>
-  <w:style w:type="paragraph" w:styleId="TOC1">
+  <w:style w:type="paragraph" w:styleId="TDC1">
     <w:name w:val="toc 1"/>
     <w:basedOn w:val="Normal"/>
     <w:next w:val="Normal"/>
@@ -5382,9 +6333,9 @@
       <w:spacing w:after="100"/>
     </w:pPr>
   </w:style>
-  <w:style w:type="character" w:styleId="Hyperlink">
+  <w:style w:type="character" w:styleId="Hipervnculo">
     <w:name w:val="Hyperlink"/>
-    <w:basedOn w:val="DefaultParagraphFont"/>
+    <w:basedOn w:val="Fuentedeprrafopredeter"/>
     <w:uiPriority w:val="99"/>
     <w:unhideWhenUsed/>
     <w:rsid w:val="00A656FE"/>
@@ -5409,7 +6360,7 @@
       <w14:ligatures w14:val="none"/>
     </w:rPr>
   </w:style>
-  <w:style w:type="paragraph" w:styleId="TOC2">
+  <w:style w:type="paragraph" w:styleId="TDC2">
     <w:name w:val="toc 2"/>
     <w:basedOn w:val="Normal"/>
     <w:next w:val="Normal"/>
@@ -5422,7 +6373,7 @@
       <w:ind w:left="240"/>
     </w:pPr>
   </w:style>
-  <w:style w:type="paragraph" w:styleId="ListNumber">
+  <w:style w:type="paragraph" w:styleId="Listaconnmeros">
     <w:name w:val="List Number"/>
     <w:basedOn w:val="Normal"/>
     <w:uiPriority w:val="99"/>
@@ -5448,7 +6399,7 @@
       <w14:ligatures w14:val="none"/>
     </w:rPr>
   </w:style>
-  <w:style w:type="paragraph" w:styleId="Caption">
+  <w:style w:type="paragraph" w:styleId="Descripcin">
     <w:name w:val="caption"/>
     <w:basedOn w:val="Normal"/>
     <w:next w:val="Normal"/>
@@ -5467,7 +6418,7 @@
       <w:szCs w:val="18"/>
     </w:rPr>
   </w:style>
-  <w:style w:type="paragraph" w:styleId="TOC3">
+  <w:style w:type="paragraph" w:styleId="TDC3">
     <w:name w:val="toc 3"/>
     <w:basedOn w:val="Normal"/>
     <w:next w:val="Normal"/>
@@ -5602,11 +6553,15 @@
   </w:compat>
   <w:rsids>
     <w:rsidRoot w:val="003C6555"/>
+    <w:rsid w:val="001B448E"/>
     <w:rsid w:val="002B5ECD"/>
     <w:rsid w:val="003C6555"/>
+    <w:rsid w:val="00434524"/>
     <w:rsid w:val="00435790"/>
     <w:rsid w:val="007A2EE3"/>
+    <w:rsid w:val="008B0225"/>
     <w:rsid w:val="00A43EF4"/>
+    <w:rsid w:val="00CC708A"/>
     <w:rsid w:val="00E62EF5"/>
   </w:rsids>
   <m:mathPr>
@@ -5624,8 +6579,8 @@
   </m:mathPr>
   <w:themeFontLang w:val="es-ES"/>
   <w:clrSchemeMapping w:bg1="light1" w:t1="dark1" w:bg2="light2" w:t2="dark2" w:accent1="accent1" w:accent2="accent2" w:accent3="accent3" w:accent4="accent4" w:accent5="accent5" w:accent6="accent6" w:hyperlink="hyperlink" w:followedHyperlink="followedHyperlink"/>
-  <w:decimalSymbol w:val="."/>
-  <w:listSeparator w:val=","/>
+  <w:decimalSymbol w:val=","/>
+  <w:listSeparator w:val=";"/>
   <w15:chartTrackingRefBased/>
 </w:settings>
 </file>
@@ -6031,13 +6986,13 @@
     <w:name w:val="Normal"/>
     <w:qFormat/>
   </w:style>
-  <w:style w:type="character" w:default="1" w:styleId="DefaultParagraphFont">
+  <w:style w:type="character" w:default="1" w:styleId="Fuentedeprrafopredeter">
     <w:name w:val="Default Paragraph Font"/>
     <w:uiPriority w:val="1"/>
     <w:semiHidden/>
     <w:unhideWhenUsed/>
   </w:style>
-  <w:style w:type="table" w:default="1" w:styleId="TableNormal">
+  <w:style w:type="table" w:default="1" w:styleId="Tablanormal">
     <w:name w:val="Normal Table"/>
     <w:uiPriority w:val="99"/>
     <w:semiHidden/>
@@ -6052,7 +7007,7 @@
       </w:tblCellMar>
     </w:tblPr>
   </w:style>
-  <w:style w:type="numbering" w:default="1" w:styleId="NoList">
+  <w:style w:type="numbering" w:default="1" w:styleId="Sinlista">
     <w:name w:val="No List"/>
     <w:uiPriority w:val="99"/>
     <w:semiHidden/>

</xml_diff>